<commit_message>
change time format for output docx
</commit_message>
<xml_diff>
--- a/src/templates/output/แบบใบเบิกเงินค่าสอน.docx
+++ b/src/templates/output/แบบใบเบิกเงินค่าสอน.docx
@@ -311,6 +311,10 @@
         <w:tblW w:w="11057" w:type="dxa"/>
         <w:tblInd w:w="-289" w:type="dxa"/>
         <w:tblLayout w:type="fixed"/>
+        <w:tblCellMar>
+          <w:left w:w="0" w:type="dxa"/>
+          <w:right w:w="0" w:type="dxa"/>
+        </w:tblCellMar>
         <w:tblLook w:val="04A0" w:firstRow="1" w:lastRow="0" w:firstColumn="1" w:lastColumn="0" w:noHBand="0" w:noVBand="1"/>
       </w:tblPr>
       <w:tblGrid>
@@ -1149,6 +1153,14 @@
                 <w:sz w:val="24"/>
                 <w:szCs w:val="24"/>
               </w:rPr>
+              <w:t xml:space="preserve"> </w:t>
+            </w:r>
+            <w:r>
+              <w:rPr>
+                <w:rFonts w:ascii="TH SarabunPSK" w:hAnsi="TH SarabunPSK" w:cs="TH SarabunPSK"/>
+                <w:sz w:val="24"/>
+                <w:szCs w:val="24"/>
+              </w:rPr>
               <w:t>{name}</w:t>
             </w:r>
           </w:p>
@@ -1298,7 +1310,6 @@
           </w:tcPr>
           <w:p>
             <w:pPr>
-              <w:jc w:val="center"/>
               <w:rPr>
                 <w:rFonts w:ascii="TH SarabunPSK" w:hAnsi="TH SarabunPSK" w:cs="TH SarabunPSK"/>
                 <w:szCs w:val="22"/>
@@ -1312,6 +1323,22 @@
               <w:t>{lec1}</w:t>
             </w:r>
           </w:p>
+          <w:p>
+            <w:pPr>
+              <w:jc w:val="right"/>
+              <w:rPr>
+                <w:rFonts w:ascii="TH SarabunPSK" w:hAnsi="TH SarabunPSK" w:cs="TH SarabunPSK"/>
+                <w:szCs w:val="22"/>
+              </w:rPr>
+            </w:pPr>
+            <w:r>
+              <w:rPr>
+                <w:rFonts w:ascii="TH SarabunPSK" w:hAnsi="TH SarabunPSK" w:cs="TH SarabunPSK"/>
+                <w:szCs w:val="22"/>
+              </w:rPr>
+              <w:t>{lec11}</w:t>
+            </w:r>
+          </w:p>
         </w:tc>
         <w:tc>
           <w:tcPr>
@@ -1320,18 +1347,47 @@
           </w:tcPr>
           <w:p>
             <w:pPr>
-              <w:jc w:val="center"/>
-              <w:rPr>
-                <w:rFonts w:ascii="TH SarabunPSK" w:hAnsi="TH SarabunPSK" w:cs="TH SarabunPSK"/>
-                <w:szCs w:val="22"/>
-              </w:rPr>
-            </w:pPr>
-            <w:r>
-              <w:rPr>
-                <w:rFonts w:ascii="TH SarabunPSK" w:hAnsi="TH SarabunPSK" w:cs="TH SarabunPSK"/>
-                <w:szCs w:val="22"/>
-              </w:rPr>
-              <w:t>{lab2}</w:t>
+              <w:rPr>
+                <w:rFonts w:ascii="TH SarabunPSK" w:hAnsi="TH SarabunPSK" w:cs="TH SarabunPSK"/>
+                <w:szCs w:val="22"/>
+              </w:rPr>
+            </w:pPr>
+            <w:r>
+              <w:rPr>
+                <w:rFonts w:ascii="TH SarabunPSK" w:hAnsi="TH SarabunPSK" w:cs="TH SarabunPSK"/>
+                <w:szCs w:val="22"/>
+              </w:rPr>
+              <w:t>{lab</w:t>
+            </w:r>
+            <w:r>
+              <w:rPr>
+                <w:rFonts w:ascii="TH SarabunPSK" w:hAnsi="TH SarabunPSK" w:cs="TH SarabunPSK"/>
+                <w:szCs w:val="22"/>
+              </w:rPr>
+              <w:t>1</w:t>
+            </w:r>
+            <w:r>
+              <w:rPr>
+                <w:rFonts w:ascii="TH SarabunPSK" w:hAnsi="TH SarabunPSK" w:cs="TH SarabunPSK"/>
+                <w:szCs w:val="22"/>
+              </w:rPr>
+              <w:t>}</w:t>
+            </w:r>
+          </w:p>
+          <w:p>
+            <w:pPr>
+              <w:jc w:val="right"/>
+              <w:rPr>
+                <w:rFonts w:ascii="TH SarabunPSK" w:hAnsi="TH SarabunPSK" w:cs="TH SarabunPSK"/>
+                <w:szCs w:val="22"/>
+              </w:rPr>
+            </w:pPr>
+            <w:r>
+              <w:rPr>
+                <w:rFonts w:ascii="TH SarabunPSK" w:hAnsi="TH SarabunPSK" w:cs="TH SarabunPSK"/>
+                <w:szCs w:val="22"/>
+              </w:rPr>
+              <w:t>{lab11}</w:t>
             </w:r>
           </w:p>
         </w:tc>
@@ -1366,7 +1422,22 @@
           </w:tcPr>
           <w:p>
             <w:pPr>
-              <w:jc w:val="center"/>
+              <w:rPr>
+                <w:rFonts w:ascii="TH SarabunPSK" w:hAnsi="TH SarabunPSK" w:cs="TH SarabunPSK"/>
+                <w:szCs w:val="22"/>
+              </w:rPr>
+            </w:pPr>
+            <w:r>
+              <w:rPr>
+                <w:rFonts w:ascii="TH SarabunPSK" w:hAnsi="TH SarabunPSK" w:cs="TH SarabunPSK"/>
+                <w:szCs w:val="22"/>
+              </w:rPr>
+              <w:t>{cle1}</w:t>
+            </w:r>
+          </w:p>
+          <w:p>
+            <w:pPr>
+              <w:jc w:val="right"/>
               <w:rPr>
                 <w:rFonts w:ascii="TH SarabunPSK" w:hAnsi="TH SarabunPSK" w:cs="TH SarabunPSK"/>
                 <w:sz w:val="16"/>
@@ -1378,7 +1449,7 @@
                 <w:rFonts w:ascii="TH SarabunPSK" w:hAnsi="TH SarabunPSK" w:cs="TH SarabunPSK"/>
                 <w:szCs w:val="22"/>
               </w:rPr>
-              <w:t>{cle1}</w:t>
+              <w:t>{cle11}</w:t>
             </w:r>
           </w:p>
         </w:tc>
@@ -1389,7 +1460,22 @@
           </w:tcPr>
           <w:p>
             <w:pPr>
-              <w:jc w:val="center"/>
+              <w:rPr>
+                <w:rFonts w:ascii="TH SarabunPSK" w:hAnsi="TH SarabunPSK" w:cs="TH SarabunPSK"/>
+                <w:szCs w:val="22"/>
+              </w:rPr>
+            </w:pPr>
+            <w:r>
+              <w:rPr>
+                <w:rFonts w:ascii="TH SarabunPSK" w:hAnsi="TH SarabunPSK" w:cs="TH SarabunPSK"/>
+                <w:szCs w:val="22"/>
+              </w:rPr>
+              <w:t>{cla1}</w:t>
+            </w:r>
+          </w:p>
+          <w:p>
+            <w:pPr>
+              <w:jc w:val="right"/>
               <w:rPr>
                 <w:rFonts w:ascii="TH SarabunPSK" w:hAnsi="TH SarabunPSK" w:cs="TH SarabunPSK"/>
                 <w:sz w:val="16"/>
@@ -1401,7 +1487,7 @@
                 <w:rFonts w:ascii="TH SarabunPSK" w:hAnsi="TH SarabunPSK" w:cs="TH SarabunPSK"/>
                 <w:szCs w:val="22"/>
               </w:rPr>
-              <w:t>{cla1}</w:t>
+              <w:t>{cla11}</w:t>
             </w:r>
           </w:p>
         </w:tc>
@@ -1555,14 +1641,7 @@
                 <w:rFonts w:ascii="TH SarabunPSK" w:hAnsi="TH SarabunPSK" w:cs="TH SarabunPSK"/>
                 <w:szCs w:val="22"/>
               </w:rPr>
-              <w:t>ubId</w:t>
-            </w:r>
-            <w:r>
-              <w:rPr>
-                <w:rFonts w:ascii="TH SarabunPSK" w:hAnsi="TH SarabunPSK" w:cs="TH SarabunPSK"/>
-                <w:szCs w:val="22"/>
-              </w:rPr>
-              <w:t>2</w:t>
+              <w:t>ubId2</w:t>
             </w:r>
             <w:r>
               <w:rPr>
@@ -1592,14 +1671,7 @@
                 <w:rFonts w:ascii="TH SarabunPSK" w:hAnsi="TH SarabunPSK" w:cs="TH SarabunPSK"/>
                 <w:szCs w:val="22"/>
               </w:rPr>
-              <w:t>ecId</w:t>
-            </w:r>
-            <w:r>
-              <w:rPr>
-                <w:rFonts w:ascii="TH SarabunPSK" w:hAnsi="TH SarabunPSK" w:cs="TH SarabunPSK"/>
-                <w:szCs w:val="22"/>
-              </w:rPr>
-              <w:t>2</w:t>
+              <w:t>ecId2</w:t>
             </w:r>
             <w:r>
               <w:rPr>
@@ -1617,7 +1689,6 @@
           </w:tcPr>
           <w:p>
             <w:pPr>
-              <w:jc w:val="center"/>
               <w:rPr>
                 <w:rFonts w:ascii="TH SarabunPSK" w:hAnsi="TH SarabunPSK" w:cs="TH SarabunPSK"/>
                 <w:szCs w:val="22"/>
@@ -1631,6 +1702,22 @@
               <w:t>{lec2}</w:t>
             </w:r>
           </w:p>
+          <w:p>
+            <w:pPr>
+              <w:jc w:val="right"/>
+              <w:rPr>
+                <w:rFonts w:ascii="TH SarabunPSK" w:hAnsi="TH SarabunPSK" w:cs="TH SarabunPSK"/>
+                <w:szCs w:val="22"/>
+              </w:rPr>
+            </w:pPr>
+            <w:r>
+              <w:rPr>
+                <w:rFonts w:ascii="TH SarabunPSK" w:hAnsi="TH SarabunPSK" w:cs="TH SarabunPSK"/>
+                <w:szCs w:val="22"/>
+              </w:rPr>
+              <w:t>{lec22}</w:t>
+            </w:r>
+          </w:p>
         </w:tc>
         <w:tc>
           <w:tcPr>
@@ -1639,7 +1726,6 @@
           </w:tcPr>
           <w:p>
             <w:pPr>
-              <w:jc w:val="center"/>
               <w:rPr>
                 <w:rFonts w:ascii="TH SarabunPSK" w:hAnsi="TH SarabunPSK" w:cs="TH SarabunPSK"/>
                 <w:szCs w:val="22"/>
@@ -1653,6 +1739,22 @@
               <w:t>{lab2}</w:t>
             </w:r>
           </w:p>
+          <w:p>
+            <w:pPr>
+              <w:jc w:val="right"/>
+              <w:rPr>
+                <w:rFonts w:ascii="TH SarabunPSK" w:hAnsi="TH SarabunPSK" w:cs="TH SarabunPSK"/>
+                <w:szCs w:val="22"/>
+              </w:rPr>
+            </w:pPr>
+            <w:r>
+              <w:rPr>
+                <w:rFonts w:ascii="TH SarabunPSK" w:hAnsi="TH SarabunPSK" w:cs="TH SarabunPSK"/>
+                <w:szCs w:val="22"/>
+              </w:rPr>
+              <w:t>{lab22}</w:t>
+            </w:r>
+          </w:p>
         </w:tc>
         <w:tc>
           <w:tcPr>
@@ -1683,7 +1785,22 @@
           </w:tcPr>
           <w:p>
             <w:pPr>
-              <w:jc w:val="center"/>
+              <w:rPr>
+                <w:rFonts w:ascii="TH SarabunPSK" w:hAnsi="TH SarabunPSK" w:cs="TH SarabunPSK"/>
+                <w:szCs w:val="22"/>
+              </w:rPr>
+            </w:pPr>
+            <w:r>
+              <w:rPr>
+                <w:rFonts w:ascii="TH SarabunPSK" w:hAnsi="TH SarabunPSK" w:cs="TH SarabunPSK"/>
+                <w:szCs w:val="22"/>
+              </w:rPr>
+              <w:t>{cle2}</w:t>
+            </w:r>
+          </w:p>
+          <w:p>
+            <w:pPr>
+              <w:jc w:val="right"/>
               <w:rPr>
                 <w:rFonts w:ascii="TH SarabunPSK" w:hAnsi="TH SarabunPSK" w:cs="TH SarabunPSK"/>
                 <w:sz w:val="16"/>
@@ -1695,7 +1812,7 @@
                 <w:rFonts w:ascii="TH SarabunPSK" w:hAnsi="TH SarabunPSK" w:cs="TH SarabunPSK"/>
                 <w:szCs w:val="22"/>
               </w:rPr>
-              <w:t>{cle2}</w:t>
+              <w:t>{cle22}</w:t>
             </w:r>
           </w:p>
         </w:tc>
@@ -1706,7 +1823,22 @@
           </w:tcPr>
           <w:p>
             <w:pPr>
-              <w:jc w:val="center"/>
+              <w:rPr>
+                <w:rFonts w:ascii="TH SarabunPSK" w:hAnsi="TH SarabunPSK" w:cs="TH SarabunPSK"/>
+                <w:szCs w:val="22"/>
+              </w:rPr>
+            </w:pPr>
+            <w:r>
+              <w:rPr>
+                <w:rFonts w:ascii="TH SarabunPSK" w:hAnsi="TH SarabunPSK" w:cs="TH SarabunPSK"/>
+                <w:szCs w:val="22"/>
+              </w:rPr>
+              <w:t>{cla2}</w:t>
+            </w:r>
+          </w:p>
+          <w:p>
+            <w:pPr>
+              <w:jc w:val="right"/>
               <w:rPr>
                 <w:rFonts w:ascii="TH SarabunPSK" w:hAnsi="TH SarabunPSK" w:cs="TH SarabunPSK"/>
                 <w:sz w:val="16"/>
@@ -1718,7 +1850,7 @@
                 <w:rFonts w:ascii="TH SarabunPSK" w:hAnsi="TH SarabunPSK" w:cs="TH SarabunPSK"/>
                 <w:szCs w:val="22"/>
               </w:rPr>
-              <w:t>{cla2}</w:t>
+              <w:t>{cla22}</w:t>
             </w:r>
           </w:p>
         </w:tc>
@@ -1870,14 +2002,7 @@
                 <w:rFonts w:ascii="TH SarabunPSK" w:hAnsi="TH SarabunPSK" w:cs="TH SarabunPSK"/>
                 <w:szCs w:val="22"/>
               </w:rPr>
-              <w:t>ubId</w:t>
-            </w:r>
-            <w:r>
-              <w:rPr>
-                <w:rFonts w:ascii="TH SarabunPSK" w:hAnsi="TH SarabunPSK" w:cs="TH SarabunPSK"/>
-                <w:szCs w:val="22"/>
-              </w:rPr>
-              <w:t>3</w:t>
+              <w:t>ubId3</w:t>
             </w:r>
             <w:r>
               <w:rPr>
@@ -1907,14 +2032,7 @@
                 <w:rFonts w:ascii="TH SarabunPSK" w:hAnsi="TH SarabunPSK" w:cs="TH SarabunPSK"/>
                 <w:szCs w:val="22"/>
               </w:rPr>
-              <w:t>ecId</w:t>
-            </w:r>
-            <w:r>
-              <w:rPr>
-                <w:rFonts w:ascii="TH SarabunPSK" w:hAnsi="TH SarabunPSK" w:cs="TH SarabunPSK"/>
-                <w:szCs w:val="22"/>
-              </w:rPr>
-              <w:t>3</w:t>
+              <w:t>ecId3</w:t>
             </w:r>
             <w:r>
               <w:rPr>
@@ -1932,7 +2050,6 @@
           </w:tcPr>
           <w:p>
             <w:pPr>
-              <w:jc w:val="center"/>
               <w:rPr>
                 <w:rFonts w:ascii="TH SarabunPSK" w:hAnsi="TH SarabunPSK" w:cs="TH SarabunPSK"/>
                 <w:szCs w:val="22"/>
@@ -1946,6 +2063,22 @@
               <w:t>{lec3}</w:t>
             </w:r>
           </w:p>
+          <w:p>
+            <w:pPr>
+              <w:jc w:val="right"/>
+              <w:rPr>
+                <w:rFonts w:ascii="TH SarabunPSK" w:hAnsi="TH SarabunPSK" w:cs="TH SarabunPSK"/>
+                <w:szCs w:val="22"/>
+              </w:rPr>
+            </w:pPr>
+            <w:r>
+              <w:rPr>
+                <w:rFonts w:ascii="TH SarabunPSK" w:hAnsi="TH SarabunPSK" w:cs="TH SarabunPSK"/>
+                <w:szCs w:val="22"/>
+              </w:rPr>
+              <w:t>{lec33}</w:t>
+            </w:r>
+          </w:p>
         </w:tc>
         <w:tc>
           <w:tcPr>
@@ -1954,7 +2087,6 @@
           </w:tcPr>
           <w:p>
             <w:pPr>
-              <w:jc w:val="center"/>
               <w:rPr>
                 <w:rFonts w:ascii="TH SarabunPSK" w:hAnsi="TH SarabunPSK" w:cs="TH SarabunPSK"/>
                 <w:szCs w:val="22"/>
@@ -1968,6 +2100,22 @@
               <w:t>{lab3}</w:t>
             </w:r>
           </w:p>
+          <w:p>
+            <w:pPr>
+              <w:jc w:val="right"/>
+              <w:rPr>
+                <w:rFonts w:ascii="TH SarabunPSK" w:hAnsi="TH SarabunPSK" w:cs="TH SarabunPSK"/>
+                <w:szCs w:val="22"/>
+              </w:rPr>
+            </w:pPr>
+            <w:r>
+              <w:rPr>
+                <w:rFonts w:ascii="TH SarabunPSK" w:hAnsi="TH SarabunPSK" w:cs="TH SarabunPSK"/>
+                <w:szCs w:val="22"/>
+              </w:rPr>
+              <w:t>{lab33}</w:t>
+            </w:r>
+          </w:p>
         </w:tc>
         <w:tc>
           <w:tcPr>
@@ -1998,7 +2146,22 @@
           </w:tcPr>
           <w:p>
             <w:pPr>
-              <w:jc w:val="center"/>
+              <w:rPr>
+                <w:rFonts w:ascii="TH SarabunPSK" w:hAnsi="TH SarabunPSK" w:cs="TH SarabunPSK"/>
+                <w:szCs w:val="22"/>
+              </w:rPr>
+            </w:pPr>
+            <w:r>
+              <w:rPr>
+                <w:rFonts w:ascii="TH SarabunPSK" w:hAnsi="TH SarabunPSK" w:cs="TH SarabunPSK"/>
+                <w:szCs w:val="22"/>
+              </w:rPr>
+              <w:t>{cle3}</w:t>
+            </w:r>
+          </w:p>
+          <w:p>
+            <w:pPr>
+              <w:jc w:val="right"/>
               <w:rPr>
                 <w:rFonts w:ascii="TH SarabunPSK" w:hAnsi="TH SarabunPSK" w:cs="TH SarabunPSK"/>
                 <w:sz w:val="16"/>
@@ -2010,7 +2173,7 @@
                 <w:rFonts w:ascii="TH SarabunPSK" w:hAnsi="TH SarabunPSK" w:cs="TH SarabunPSK"/>
                 <w:szCs w:val="22"/>
               </w:rPr>
-              <w:t>{cle3}</w:t>
+              <w:t>{cle33}</w:t>
             </w:r>
           </w:p>
         </w:tc>
@@ -2021,7 +2184,22 @@
           </w:tcPr>
           <w:p>
             <w:pPr>
-              <w:jc w:val="center"/>
+              <w:rPr>
+                <w:rFonts w:ascii="TH SarabunPSK" w:hAnsi="TH SarabunPSK" w:cs="TH SarabunPSK"/>
+                <w:szCs w:val="22"/>
+              </w:rPr>
+            </w:pPr>
+            <w:r>
+              <w:rPr>
+                <w:rFonts w:ascii="TH SarabunPSK" w:hAnsi="TH SarabunPSK" w:cs="TH SarabunPSK"/>
+                <w:szCs w:val="22"/>
+              </w:rPr>
+              <w:t>{cla3}</w:t>
+            </w:r>
+          </w:p>
+          <w:p>
+            <w:pPr>
+              <w:jc w:val="right"/>
               <w:rPr>
                 <w:rFonts w:ascii="TH SarabunPSK" w:hAnsi="TH SarabunPSK" w:cs="TH SarabunPSK"/>
                 <w:sz w:val="16"/>
@@ -2033,7 +2211,7 @@
                 <w:rFonts w:ascii="TH SarabunPSK" w:hAnsi="TH SarabunPSK" w:cs="TH SarabunPSK"/>
                 <w:szCs w:val="22"/>
               </w:rPr>
-              <w:t>{cla3}</w:t>
+              <w:t>{cla33}</w:t>
             </w:r>
           </w:p>
         </w:tc>
@@ -2183,14 +2361,7 @@
                 <w:rFonts w:ascii="TH SarabunPSK" w:hAnsi="TH SarabunPSK" w:cs="TH SarabunPSK"/>
                 <w:szCs w:val="22"/>
               </w:rPr>
-              <w:t>ubId</w:t>
-            </w:r>
-            <w:r>
-              <w:rPr>
-                <w:rFonts w:ascii="TH SarabunPSK" w:hAnsi="TH SarabunPSK" w:cs="TH SarabunPSK"/>
-                <w:szCs w:val="22"/>
-              </w:rPr>
-              <w:t>4</w:t>
+              <w:t>ubId4</w:t>
             </w:r>
             <w:r>
               <w:rPr>
@@ -2220,14 +2391,7 @@
                 <w:rFonts w:ascii="TH SarabunPSK" w:hAnsi="TH SarabunPSK" w:cs="TH SarabunPSK"/>
                 <w:szCs w:val="22"/>
               </w:rPr>
-              <w:t>ecId</w:t>
-            </w:r>
-            <w:r>
-              <w:rPr>
-                <w:rFonts w:ascii="TH SarabunPSK" w:hAnsi="TH SarabunPSK" w:cs="TH SarabunPSK"/>
-                <w:szCs w:val="22"/>
-              </w:rPr>
-              <w:t>4</w:t>
+              <w:t>ecId4</w:t>
             </w:r>
             <w:r>
               <w:rPr>
@@ -2245,7 +2409,6 @@
           </w:tcPr>
           <w:p>
             <w:pPr>
-              <w:jc w:val="center"/>
               <w:rPr>
                 <w:rFonts w:ascii="TH SarabunPSK" w:hAnsi="TH SarabunPSK" w:cs="TH SarabunPSK"/>
                 <w:szCs w:val="22"/>
@@ -2259,6 +2422,22 @@
               <w:t>{lec4}</w:t>
             </w:r>
           </w:p>
+          <w:p>
+            <w:pPr>
+              <w:jc w:val="right"/>
+              <w:rPr>
+                <w:rFonts w:ascii="TH SarabunPSK" w:hAnsi="TH SarabunPSK" w:cs="TH SarabunPSK"/>
+                <w:szCs w:val="22"/>
+              </w:rPr>
+            </w:pPr>
+            <w:r>
+              <w:rPr>
+                <w:rFonts w:ascii="TH SarabunPSK" w:hAnsi="TH SarabunPSK" w:cs="TH SarabunPSK"/>
+                <w:szCs w:val="22"/>
+              </w:rPr>
+              <w:t>{lec44}</w:t>
+            </w:r>
+          </w:p>
         </w:tc>
         <w:tc>
           <w:tcPr>
@@ -2267,7 +2446,6 @@
           </w:tcPr>
           <w:p>
             <w:pPr>
-              <w:jc w:val="center"/>
               <w:rPr>
                 <w:rFonts w:ascii="TH SarabunPSK" w:hAnsi="TH SarabunPSK" w:cs="TH SarabunPSK"/>
                 <w:szCs w:val="22"/>
@@ -2281,6 +2459,22 @@
               <w:t>{lab4}</w:t>
             </w:r>
           </w:p>
+          <w:p>
+            <w:pPr>
+              <w:jc w:val="right"/>
+              <w:rPr>
+                <w:rFonts w:ascii="TH SarabunPSK" w:hAnsi="TH SarabunPSK" w:cs="TH SarabunPSK"/>
+                <w:szCs w:val="22"/>
+              </w:rPr>
+            </w:pPr>
+            <w:r>
+              <w:rPr>
+                <w:rFonts w:ascii="TH SarabunPSK" w:hAnsi="TH SarabunPSK" w:cs="TH SarabunPSK"/>
+                <w:szCs w:val="22"/>
+              </w:rPr>
+              <w:t>{lab44}</w:t>
+            </w:r>
+          </w:p>
         </w:tc>
         <w:tc>
           <w:tcPr>
@@ -2311,7 +2505,22 @@
           </w:tcPr>
           <w:p>
             <w:pPr>
-              <w:jc w:val="center"/>
+              <w:rPr>
+                <w:rFonts w:ascii="TH SarabunPSK" w:hAnsi="TH SarabunPSK" w:cs="TH SarabunPSK"/>
+                <w:szCs w:val="22"/>
+              </w:rPr>
+            </w:pPr>
+            <w:r>
+              <w:rPr>
+                <w:rFonts w:ascii="TH SarabunPSK" w:hAnsi="TH SarabunPSK" w:cs="TH SarabunPSK"/>
+                <w:szCs w:val="22"/>
+              </w:rPr>
+              <w:t>{cle4}</w:t>
+            </w:r>
+          </w:p>
+          <w:p>
+            <w:pPr>
+              <w:jc w:val="right"/>
               <w:rPr>
                 <w:rFonts w:ascii="TH SarabunPSK" w:hAnsi="TH SarabunPSK" w:cs="TH SarabunPSK"/>
                 <w:sz w:val="16"/>
@@ -2323,7 +2532,7 @@
                 <w:rFonts w:ascii="TH SarabunPSK" w:hAnsi="TH SarabunPSK" w:cs="TH SarabunPSK"/>
                 <w:szCs w:val="22"/>
               </w:rPr>
-              <w:t>{cle4}</w:t>
+              <w:t>{cle44}</w:t>
             </w:r>
           </w:p>
         </w:tc>
@@ -2334,7 +2543,22 @@
           </w:tcPr>
           <w:p>
             <w:pPr>
-              <w:jc w:val="center"/>
+              <w:rPr>
+                <w:rFonts w:ascii="TH SarabunPSK" w:hAnsi="TH SarabunPSK" w:cs="TH SarabunPSK"/>
+                <w:szCs w:val="22"/>
+              </w:rPr>
+            </w:pPr>
+            <w:r>
+              <w:rPr>
+                <w:rFonts w:ascii="TH SarabunPSK" w:hAnsi="TH SarabunPSK" w:cs="TH SarabunPSK"/>
+                <w:szCs w:val="22"/>
+              </w:rPr>
+              <w:t>{cla4}</w:t>
+            </w:r>
+          </w:p>
+          <w:p>
+            <w:pPr>
+              <w:jc w:val="right"/>
               <w:rPr>
                 <w:rFonts w:ascii="TH SarabunPSK" w:hAnsi="TH SarabunPSK" w:cs="TH SarabunPSK"/>
                 <w:sz w:val="16"/>
@@ -2346,7 +2570,7 @@
                 <w:rFonts w:ascii="TH SarabunPSK" w:hAnsi="TH SarabunPSK" w:cs="TH SarabunPSK"/>
                 <w:szCs w:val="22"/>
               </w:rPr>
-              <w:t>{cla4}</w:t>
+              <w:t>{cla44}</w:t>
             </w:r>
           </w:p>
         </w:tc>
@@ -2496,14 +2720,7 @@
                 <w:rFonts w:ascii="TH SarabunPSK" w:hAnsi="TH SarabunPSK" w:cs="TH SarabunPSK"/>
                 <w:szCs w:val="22"/>
               </w:rPr>
-              <w:t>ubId</w:t>
-            </w:r>
-            <w:r>
-              <w:rPr>
-                <w:rFonts w:ascii="TH SarabunPSK" w:hAnsi="TH SarabunPSK" w:cs="TH SarabunPSK"/>
-                <w:szCs w:val="22"/>
-              </w:rPr>
-              <w:t>5</w:t>
+              <w:t>ubId5</w:t>
             </w:r>
             <w:r>
               <w:rPr>
@@ -2533,14 +2750,7 @@
                 <w:rFonts w:ascii="TH SarabunPSK" w:hAnsi="TH SarabunPSK" w:cs="TH SarabunPSK"/>
                 <w:szCs w:val="22"/>
               </w:rPr>
-              <w:t>ecId</w:t>
-            </w:r>
-            <w:r>
-              <w:rPr>
-                <w:rFonts w:ascii="TH SarabunPSK" w:hAnsi="TH SarabunPSK" w:cs="TH SarabunPSK"/>
-                <w:szCs w:val="22"/>
-              </w:rPr>
-              <w:t>5</w:t>
+              <w:t>ecId5</w:t>
             </w:r>
             <w:r>
               <w:rPr>
@@ -2558,7 +2768,6 @@
           </w:tcPr>
           <w:p>
             <w:pPr>
-              <w:jc w:val="center"/>
               <w:rPr>
                 <w:rFonts w:ascii="TH SarabunPSK" w:hAnsi="TH SarabunPSK" w:cs="TH SarabunPSK"/>
                 <w:szCs w:val="22"/>
@@ -2572,6 +2781,22 @@
               <w:t>{lec5}</w:t>
             </w:r>
           </w:p>
+          <w:p>
+            <w:pPr>
+              <w:jc w:val="right"/>
+              <w:rPr>
+                <w:rFonts w:ascii="TH SarabunPSK" w:hAnsi="TH SarabunPSK" w:cs="TH SarabunPSK"/>
+                <w:szCs w:val="22"/>
+              </w:rPr>
+            </w:pPr>
+            <w:r>
+              <w:rPr>
+                <w:rFonts w:ascii="TH SarabunPSK" w:hAnsi="TH SarabunPSK" w:cs="TH SarabunPSK"/>
+                <w:szCs w:val="22"/>
+              </w:rPr>
+              <w:t>{lec55}</w:t>
+            </w:r>
+          </w:p>
         </w:tc>
         <w:tc>
           <w:tcPr>
@@ -2580,7 +2805,6 @@
           </w:tcPr>
           <w:p>
             <w:pPr>
-              <w:jc w:val="center"/>
               <w:rPr>
                 <w:rFonts w:ascii="TH SarabunPSK" w:hAnsi="TH SarabunPSK" w:cs="TH SarabunPSK"/>
                 <w:szCs w:val="22"/>
@@ -2594,6 +2818,22 @@
               <w:t>{lab5}</w:t>
             </w:r>
           </w:p>
+          <w:p>
+            <w:pPr>
+              <w:jc w:val="right"/>
+              <w:rPr>
+                <w:rFonts w:ascii="TH SarabunPSK" w:hAnsi="TH SarabunPSK" w:cs="TH SarabunPSK"/>
+                <w:szCs w:val="22"/>
+              </w:rPr>
+            </w:pPr>
+            <w:r>
+              <w:rPr>
+                <w:rFonts w:ascii="TH SarabunPSK" w:hAnsi="TH SarabunPSK" w:cs="TH SarabunPSK"/>
+                <w:szCs w:val="22"/>
+              </w:rPr>
+              <w:t>{lab55}</w:t>
+            </w:r>
+          </w:p>
         </w:tc>
         <w:tc>
           <w:tcPr>
@@ -2624,7 +2864,22 @@
           </w:tcPr>
           <w:p>
             <w:pPr>
-              <w:jc w:val="center"/>
+              <w:rPr>
+                <w:rFonts w:ascii="TH SarabunPSK" w:hAnsi="TH SarabunPSK" w:cs="TH SarabunPSK"/>
+                <w:szCs w:val="22"/>
+              </w:rPr>
+            </w:pPr>
+            <w:r>
+              <w:rPr>
+                <w:rFonts w:ascii="TH SarabunPSK" w:hAnsi="TH SarabunPSK" w:cs="TH SarabunPSK"/>
+                <w:szCs w:val="22"/>
+              </w:rPr>
+              <w:t>{cle5}</w:t>
+            </w:r>
+          </w:p>
+          <w:p>
+            <w:pPr>
+              <w:jc w:val="right"/>
               <w:rPr>
                 <w:rFonts w:ascii="TH SarabunPSK" w:hAnsi="TH SarabunPSK" w:cs="TH SarabunPSK"/>
                 <w:sz w:val="16"/>
@@ -2636,7 +2891,7 @@
                 <w:rFonts w:ascii="TH SarabunPSK" w:hAnsi="TH SarabunPSK" w:cs="TH SarabunPSK"/>
                 <w:szCs w:val="22"/>
               </w:rPr>
-              <w:t>{cle5}</w:t>
+              <w:t>{cle55}</w:t>
             </w:r>
           </w:p>
         </w:tc>
@@ -2647,7 +2902,22 @@
           </w:tcPr>
           <w:p>
             <w:pPr>
-              <w:jc w:val="center"/>
+              <w:rPr>
+                <w:rFonts w:ascii="TH SarabunPSK" w:hAnsi="TH SarabunPSK" w:cs="TH SarabunPSK"/>
+                <w:szCs w:val="22"/>
+              </w:rPr>
+            </w:pPr>
+            <w:r>
+              <w:rPr>
+                <w:rFonts w:ascii="TH SarabunPSK" w:hAnsi="TH SarabunPSK" w:cs="TH SarabunPSK"/>
+                <w:szCs w:val="22"/>
+              </w:rPr>
+              <w:t>{cla5}</w:t>
+            </w:r>
+          </w:p>
+          <w:p>
+            <w:pPr>
+              <w:jc w:val="right"/>
               <w:rPr>
                 <w:rFonts w:ascii="TH SarabunPSK" w:hAnsi="TH SarabunPSK" w:cs="TH SarabunPSK"/>
                 <w:sz w:val="16"/>
@@ -2659,7 +2929,7 @@
                 <w:rFonts w:ascii="TH SarabunPSK" w:hAnsi="TH SarabunPSK" w:cs="TH SarabunPSK"/>
                 <w:szCs w:val="22"/>
               </w:rPr>
-              <w:t>{cla5}</w:t>
+              <w:t>{cla55}</w:t>
             </w:r>
           </w:p>
         </w:tc>
@@ -2809,14 +3079,7 @@
                 <w:rFonts w:ascii="TH SarabunPSK" w:hAnsi="TH SarabunPSK" w:cs="TH SarabunPSK"/>
                 <w:szCs w:val="22"/>
               </w:rPr>
-              <w:t>ubId</w:t>
-            </w:r>
-            <w:r>
-              <w:rPr>
-                <w:rFonts w:ascii="TH SarabunPSK" w:hAnsi="TH SarabunPSK" w:cs="TH SarabunPSK"/>
-                <w:szCs w:val="22"/>
-              </w:rPr>
-              <w:t>6</w:t>
+              <w:t>ubId6</w:t>
             </w:r>
             <w:r>
               <w:rPr>
@@ -2846,14 +3109,7 @@
                 <w:rFonts w:ascii="TH SarabunPSK" w:hAnsi="TH SarabunPSK" w:cs="TH SarabunPSK"/>
                 <w:szCs w:val="22"/>
               </w:rPr>
-              <w:t>ecId</w:t>
-            </w:r>
-            <w:r>
-              <w:rPr>
-                <w:rFonts w:ascii="TH SarabunPSK" w:hAnsi="TH SarabunPSK" w:cs="TH SarabunPSK"/>
-                <w:szCs w:val="22"/>
-              </w:rPr>
-              <w:t>6</w:t>
+              <w:t>ecId6</w:t>
             </w:r>
             <w:r>
               <w:rPr>
@@ -2871,7 +3127,6 @@
           </w:tcPr>
           <w:p>
             <w:pPr>
-              <w:jc w:val="center"/>
               <w:rPr>
                 <w:rFonts w:ascii="TH SarabunPSK" w:hAnsi="TH SarabunPSK" w:cs="TH SarabunPSK"/>
                 <w:szCs w:val="22"/>
@@ -2885,6 +3140,22 @@
               <w:t>{lec6}</w:t>
             </w:r>
           </w:p>
+          <w:p>
+            <w:pPr>
+              <w:jc w:val="right"/>
+              <w:rPr>
+                <w:rFonts w:ascii="TH SarabunPSK" w:hAnsi="TH SarabunPSK" w:cs="TH SarabunPSK"/>
+                <w:szCs w:val="22"/>
+              </w:rPr>
+            </w:pPr>
+            <w:r>
+              <w:rPr>
+                <w:rFonts w:ascii="TH SarabunPSK" w:hAnsi="TH SarabunPSK" w:cs="TH SarabunPSK"/>
+                <w:szCs w:val="22"/>
+              </w:rPr>
+              <w:t>{lec66}</w:t>
+            </w:r>
+          </w:p>
         </w:tc>
         <w:tc>
           <w:tcPr>
@@ -2893,7 +3164,6 @@
           </w:tcPr>
           <w:p>
             <w:pPr>
-              <w:jc w:val="center"/>
               <w:rPr>
                 <w:rFonts w:ascii="TH SarabunPSK" w:hAnsi="TH SarabunPSK" w:cs="TH SarabunPSK"/>
                 <w:szCs w:val="22"/>
@@ -2907,6 +3177,29 @@
               <w:t>{lab6}</w:t>
             </w:r>
           </w:p>
+          <w:p>
+            <w:pPr>
+              <w:jc w:val="right"/>
+              <w:rPr>
+                <w:rFonts w:ascii="TH SarabunPSK" w:hAnsi="TH SarabunPSK" w:cs="TH SarabunPSK"/>
+                <w:szCs w:val="22"/>
+              </w:rPr>
+            </w:pPr>
+            <w:r>
+              <w:rPr>
+                <w:rFonts w:ascii="TH SarabunPSK" w:hAnsi="TH SarabunPSK" w:cs="TH SarabunPSK"/>
+                <w:szCs w:val="22"/>
+              </w:rPr>
+              <w:t>{lab66</w:t>
+            </w:r>
+            <w:r>
+              <w:rPr>
+                <w:rFonts w:ascii="TH SarabunPSK" w:hAnsi="TH SarabunPSK" w:cs="TH SarabunPSK"/>
+                <w:szCs w:val="22"/>
+              </w:rPr>
+              <w:t>}</w:t>
+            </w:r>
+          </w:p>
         </w:tc>
         <w:tc>
           <w:tcPr>
@@ -2937,7 +3230,22 @@
           </w:tcPr>
           <w:p>
             <w:pPr>
-              <w:jc w:val="center"/>
+              <w:rPr>
+                <w:rFonts w:ascii="TH SarabunPSK" w:hAnsi="TH SarabunPSK" w:cs="TH SarabunPSK"/>
+                <w:szCs w:val="22"/>
+              </w:rPr>
+            </w:pPr>
+            <w:r>
+              <w:rPr>
+                <w:rFonts w:ascii="TH SarabunPSK" w:hAnsi="TH SarabunPSK" w:cs="TH SarabunPSK"/>
+                <w:szCs w:val="22"/>
+              </w:rPr>
+              <w:t>{cle6}</w:t>
+            </w:r>
+          </w:p>
+          <w:p>
+            <w:pPr>
+              <w:jc w:val="right"/>
               <w:rPr>
                 <w:rFonts w:ascii="TH SarabunPSK" w:hAnsi="TH SarabunPSK" w:cs="TH SarabunPSK"/>
                 <w:sz w:val="16"/>
@@ -2949,7 +3257,7 @@
                 <w:rFonts w:ascii="TH SarabunPSK" w:hAnsi="TH SarabunPSK" w:cs="TH SarabunPSK"/>
                 <w:szCs w:val="22"/>
               </w:rPr>
-              <w:t>{cle6}</w:t>
+              <w:t>{cle66}</w:t>
             </w:r>
           </w:p>
         </w:tc>
@@ -2960,7 +3268,22 @@
           </w:tcPr>
           <w:p>
             <w:pPr>
-              <w:jc w:val="center"/>
+              <w:rPr>
+                <w:rFonts w:ascii="TH SarabunPSK" w:hAnsi="TH SarabunPSK" w:cs="TH SarabunPSK"/>
+                <w:szCs w:val="22"/>
+              </w:rPr>
+            </w:pPr>
+            <w:r>
+              <w:rPr>
+                <w:rFonts w:ascii="TH SarabunPSK" w:hAnsi="TH SarabunPSK" w:cs="TH SarabunPSK"/>
+                <w:szCs w:val="22"/>
+              </w:rPr>
+              <w:t>{cla6}</w:t>
+            </w:r>
+          </w:p>
+          <w:p>
+            <w:pPr>
+              <w:jc w:val="right"/>
               <w:rPr>
                 <w:rFonts w:ascii="TH SarabunPSK" w:hAnsi="TH SarabunPSK" w:cs="TH SarabunPSK"/>
                 <w:sz w:val="16"/>
@@ -2972,7 +3295,7 @@
                 <w:rFonts w:ascii="TH SarabunPSK" w:hAnsi="TH SarabunPSK" w:cs="TH SarabunPSK"/>
                 <w:szCs w:val="22"/>
               </w:rPr>
-              <w:t>{cla6}</w:t>
+              <w:t>{cla66}</w:t>
             </w:r>
           </w:p>
         </w:tc>
@@ -4228,27 +4551,7 @@
                 <w:bCs/>
                 <w:szCs w:val="22"/>
               </w:rPr>
-              <w:t>{</w:t>
-            </w:r>
-            <w:proofErr w:type="spellStart"/>
-            <w:r>
-              <w:rPr>
-                <w:rFonts w:ascii="TH SarabunPSK" w:hAnsi="TH SarabunPSK" w:cs="TH SarabunPSK"/>
-                <w:b/>
-                <w:bCs/>
-                <w:szCs w:val="22"/>
-              </w:rPr>
-              <w:t>ht</w:t>
-            </w:r>
-            <w:proofErr w:type="spellEnd"/>
-            <w:r>
-              <w:rPr>
-                <w:rFonts w:ascii="TH SarabunPSK" w:hAnsi="TH SarabunPSK" w:cs="TH SarabunPSK"/>
-                <w:b/>
-                <w:bCs/>
-                <w:szCs w:val="22"/>
-              </w:rPr>
-              <w:t>}</w:t>
+              <w:t>{ht}</w:t>
             </w:r>
           </w:p>
         </w:tc>
@@ -4308,27 +4611,7 @@
                 <w:bCs/>
                 <w:szCs w:val="22"/>
               </w:rPr>
-              <w:t>{</w:t>
-            </w:r>
-            <w:proofErr w:type="spellStart"/>
-            <w:r>
-              <w:rPr>
-                <w:rFonts w:ascii="TH SarabunPSK" w:hAnsi="TH SarabunPSK" w:cs="TH SarabunPSK"/>
-                <w:b/>
-                <w:bCs/>
-                <w:szCs w:val="22"/>
-              </w:rPr>
-              <w:t>cht</w:t>
-            </w:r>
-            <w:proofErr w:type="spellEnd"/>
-            <w:r>
-              <w:rPr>
-                <w:rFonts w:ascii="TH SarabunPSK" w:hAnsi="TH SarabunPSK" w:cs="TH SarabunPSK"/>
-                <w:b/>
-                <w:bCs/>
-                <w:szCs w:val="22"/>
-              </w:rPr>
-              <w:t>}</w:t>
+              <w:t>{cht}</w:t>
             </w:r>
           </w:p>
         </w:tc>
@@ -4429,7 +4712,7 @@
           <w:cs/>
         </w:rPr>
         <w:br/>
-        <w:t xml:space="preserve">                เวลาที่สอน     </w:t>
+        <w:t xml:space="preserve">              </w:t>
       </w:r>
       <w:r>
         <w:rPr>
@@ -4442,24 +4725,23 @@
         <w:rPr>
           <w:rFonts w:ascii="TH SarabunPSK" w:hAnsi="TH SarabunPSK" w:cs="TH SarabunPSK"/>
           <w:sz w:val="28"/>
-        </w:rPr>
-        <w:t>{</w:t>
-      </w:r>
-      <w:proofErr w:type="spellStart"/>
-      <w:r>
-        <w:rPr>
-          <w:rFonts w:ascii="TH SarabunPSK" w:hAnsi="TH SarabunPSK" w:cs="TH SarabunPSK"/>
-          <w:sz w:val="28"/>
-        </w:rPr>
-        <w:t>th</w:t>
-      </w:r>
-      <w:proofErr w:type="spellEnd"/>
-      <w:r>
-        <w:rPr>
-          <w:rFonts w:ascii="TH SarabunPSK" w:hAnsi="TH SarabunPSK" w:cs="TH SarabunPSK"/>
-          <w:sz w:val="28"/>
-        </w:rPr>
-        <w:t>}</w:t>
+          <w:cs/>
+        </w:rPr>
+        <w:t xml:space="preserve">เวลาที่สอน     </w:t>
+      </w:r>
+      <w:r>
+        <w:rPr>
+          <w:rFonts w:ascii="TH SarabunPSK" w:hAnsi="TH SarabunPSK" w:cs="TH SarabunPSK"/>
+          <w:sz w:val="28"/>
+        </w:rPr>
+        <w:t xml:space="preserve"> </w:t>
+      </w:r>
+      <w:r>
+        <w:rPr>
+          <w:rFonts w:ascii="TH SarabunPSK" w:hAnsi="TH SarabunPSK" w:cs="TH SarabunPSK"/>
+          <w:sz w:val="28"/>
+        </w:rPr>
+        <w:t>{th}</w:t>
       </w:r>
       <w:r>
         <w:rPr>

</xml_diff>

<commit_message>
remove - when data is null
</commit_message>
<xml_diff>
--- a/src/templates/output/แบบใบเบิกเงินค่าสอน.docx
+++ b/src/templates/output/แบบใบเบิกเงินค่าสอน.docx
@@ -312,8 +312,8 @@
         <w:tblInd w:w="-289" w:type="dxa"/>
         <w:tblLayout w:type="fixed"/>
         <w:tblCellMar>
-          <w:left w:w="0" w:type="dxa"/>
-          <w:right w:w="0" w:type="dxa"/>
+          <w:left w:w="28" w:type="dxa"/>
+          <w:right w:w="28" w:type="dxa"/>
         </w:tblCellMar>
         <w:tblLook w:val="04A0" w:firstRow="1" w:lastRow="0" w:firstColumn="1" w:lastColumn="0" w:noHBand="0" w:noVBand="1"/>
       </w:tblPr>
@@ -611,6 +611,7 @@
           <w:tcPr>
             <w:tcW w:w="1984" w:type="dxa"/>
             <w:gridSpan w:val="3"/>
+            <w:vAlign w:val="center"/>
           </w:tcPr>
           <w:p>
             <w:pPr>
@@ -652,6 +653,7 @@
           <w:tcPr>
             <w:tcW w:w="2126" w:type="dxa"/>
             <w:gridSpan w:val="3"/>
+            <w:vAlign w:val="center"/>
           </w:tcPr>
           <w:p>
             <w:pPr>
@@ -774,10 +776,23 @@
                 <w:bCs/>
                 <w:sz w:val="24"/>
                 <w:szCs w:val="24"/>
+              </w:rPr>
+            </w:pPr>
+            <w:r>
+              <w:rPr>
+                <w:rFonts w:ascii="TH SarabunPSK" w:hAnsi="TH SarabunPSK" w:cs="TH SarabunPSK"/>
+                <w:b/>
+                <w:bCs/>
+                <w:sz w:val="24"/>
+                <w:szCs w:val="24"/>
                 <w:cs/>
               </w:rPr>
-            </w:pPr>
-            <w:r>
+              <w:t>สับดาห์</w:t>
+            </w:r>
+          </w:p>
+          <w:p>
+            <w:pPr>
+              <w:jc w:val="center"/>
               <w:rPr>
                 <w:rFonts w:ascii="TH SarabunPSK" w:hAnsi="TH SarabunPSK" w:cs="TH SarabunPSK"/>
                 <w:b/>
@@ -786,7 +801,17 @@
                 <w:szCs w:val="24"/>
                 <w:cs/>
               </w:rPr>
-              <w:t>สับดาห์ที่</w:t>
+            </w:pPr>
+            <w:r>
+              <w:rPr>
+                <w:rFonts w:ascii="TH SarabunPSK" w:hAnsi="TH SarabunPSK" w:cs="TH SarabunPSK"/>
+                <w:b/>
+                <w:bCs/>
+                <w:sz w:val="24"/>
+                <w:szCs w:val="24"/>
+                <w:cs/>
+              </w:rPr>
+              <w:t>ที่</w:t>
             </w:r>
           </w:p>
         </w:tc>
@@ -883,6 +908,7 @@
         <w:tc>
           <w:tcPr>
             <w:tcW w:w="708" w:type="dxa"/>
+            <w:vAlign w:val="center"/>
           </w:tcPr>
           <w:p>
             <w:pPr>
@@ -924,6 +950,7 @@
         <w:tc>
           <w:tcPr>
             <w:tcW w:w="709" w:type="dxa"/>
+            <w:vAlign w:val="center"/>
           </w:tcPr>
           <w:p>
             <w:pPr>
@@ -965,6 +992,7 @@
         <w:tc>
           <w:tcPr>
             <w:tcW w:w="567" w:type="dxa"/>
+            <w:vAlign w:val="center"/>
           </w:tcPr>
           <w:p>
             <w:pPr>
@@ -994,6 +1022,7 @@
         <w:tc>
           <w:tcPr>
             <w:tcW w:w="709" w:type="dxa"/>
+            <w:vAlign w:val="center"/>
           </w:tcPr>
           <w:p>
             <w:pPr>
@@ -1035,6 +1064,7 @@
         <w:tc>
           <w:tcPr>
             <w:tcW w:w="709" w:type="dxa"/>
+            <w:vAlign w:val="center"/>
           </w:tcPr>
           <w:p>
             <w:pPr>
@@ -1076,6 +1106,7 @@
         <w:tc>
           <w:tcPr>
             <w:tcW w:w="708" w:type="dxa"/>
+            <w:vAlign w:val="center"/>
           </w:tcPr>
           <w:p>
             <w:pPr>
@@ -1276,8 +1307,7 @@
               <w:jc w:val="right"/>
               <w:rPr>
                 <w:rFonts w:ascii="TH SarabunPSK" w:hAnsi="TH SarabunPSK" w:cs="TH SarabunPSK"/>
-                <w:sz w:val="16"/>
-                <w:szCs w:val="16"/>
+                <w:szCs w:val="22"/>
               </w:rPr>
             </w:pPr>
             <w:r>
@@ -1312,13 +1342,15 @@
             <w:pPr>
               <w:rPr>
                 <w:rFonts w:ascii="TH SarabunPSK" w:hAnsi="TH SarabunPSK" w:cs="TH SarabunPSK"/>
-                <w:szCs w:val="22"/>
-              </w:rPr>
-            </w:pPr>
-            <w:r>
-              <w:rPr>
-                <w:rFonts w:ascii="TH SarabunPSK" w:hAnsi="TH SarabunPSK" w:cs="TH SarabunPSK"/>
-                <w:szCs w:val="22"/>
+                <w:sz w:val="18"/>
+                <w:szCs w:val="18"/>
+              </w:rPr>
+            </w:pPr>
+            <w:r>
+              <w:rPr>
+                <w:rFonts w:ascii="TH SarabunPSK" w:hAnsi="TH SarabunPSK" w:cs="TH SarabunPSK"/>
+                <w:sz w:val="18"/>
+                <w:szCs w:val="18"/>
               </w:rPr>
               <w:t>{lec1}</w:t>
             </w:r>
@@ -1328,13 +1360,15 @@
               <w:jc w:val="right"/>
               <w:rPr>
                 <w:rFonts w:ascii="TH SarabunPSK" w:hAnsi="TH SarabunPSK" w:cs="TH SarabunPSK"/>
-                <w:szCs w:val="22"/>
-              </w:rPr>
-            </w:pPr>
-            <w:r>
-              <w:rPr>
-                <w:rFonts w:ascii="TH SarabunPSK" w:hAnsi="TH SarabunPSK" w:cs="TH SarabunPSK"/>
-                <w:szCs w:val="22"/>
+                <w:sz w:val="18"/>
+                <w:szCs w:val="18"/>
+              </w:rPr>
+            </w:pPr>
+            <w:r>
+              <w:rPr>
+                <w:rFonts w:ascii="TH SarabunPSK" w:hAnsi="TH SarabunPSK" w:cs="TH SarabunPSK"/>
+                <w:sz w:val="18"/>
+                <w:szCs w:val="18"/>
               </w:rPr>
               <w:t>{lec11}</w:t>
             </w:r>
@@ -1349,27 +1383,31 @@
             <w:pPr>
               <w:rPr>
                 <w:rFonts w:ascii="TH SarabunPSK" w:hAnsi="TH SarabunPSK" w:cs="TH SarabunPSK"/>
-                <w:szCs w:val="22"/>
-              </w:rPr>
-            </w:pPr>
-            <w:r>
-              <w:rPr>
-                <w:rFonts w:ascii="TH SarabunPSK" w:hAnsi="TH SarabunPSK" w:cs="TH SarabunPSK"/>
-                <w:szCs w:val="22"/>
+                <w:sz w:val="18"/>
+                <w:szCs w:val="18"/>
+              </w:rPr>
+            </w:pPr>
+            <w:r>
+              <w:rPr>
+                <w:rFonts w:ascii="TH SarabunPSK" w:hAnsi="TH SarabunPSK" w:cs="TH SarabunPSK"/>
+                <w:sz w:val="18"/>
+                <w:szCs w:val="18"/>
               </w:rPr>
               <w:t>{lab</w:t>
             </w:r>
             <w:r>
               <w:rPr>
                 <w:rFonts w:ascii="TH SarabunPSK" w:hAnsi="TH SarabunPSK" w:cs="TH SarabunPSK"/>
-                <w:szCs w:val="22"/>
+                <w:sz w:val="18"/>
+                <w:szCs w:val="18"/>
               </w:rPr>
               <w:t>1</w:t>
             </w:r>
             <w:r>
               <w:rPr>
                 <w:rFonts w:ascii="TH SarabunPSK" w:hAnsi="TH SarabunPSK" w:cs="TH SarabunPSK"/>
-                <w:szCs w:val="22"/>
+                <w:sz w:val="18"/>
+                <w:szCs w:val="18"/>
               </w:rPr>
               <w:t>}</w:t>
             </w:r>
@@ -1379,13 +1417,15 @@
               <w:jc w:val="right"/>
               <w:rPr>
                 <w:rFonts w:ascii="TH SarabunPSK" w:hAnsi="TH SarabunPSK" w:cs="TH SarabunPSK"/>
-                <w:szCs w:val="22"/>
-              </w:rPr>
-            </w:pPr>
-            <w:r>
-              <w:rPr>
-                <w:rFonts w:ascii="TH SarabunPSK" w:hAnsi="TH SarabunPSK" w:cs="TH SarabunPSK"/>
-                <w:szCs w:val="22"/>
+                <w:sz w:val="18"/>
+                <w:szCs w:val="18"/>
+              </w:rPr>
+            </w:pPr>
+            <w:r>
+              <w:rPr>
+                <w:rFonts w:ascii="TH SarabunPSK" w:hAnsi="TH SarabunPSK" w:cs="TH SarabunPSK"/>
+                <w:sz w:val="18"/>
+                <w:szCs w:val="18"/>
               </w:rPr>
               <w:t>{lab11}</w:t>
             </w:r>
@@ -1424,13 +1464,15 @@
             <w:pPr>
               <w:rPr>
                 <w:rFonts w:ascii="TH SarabunPSK" w:hAnsi="TH SarabunPSK" w:cs="TH SarabunPSK"/>
-                <w:szCs w:val="22"/>
-              </w:rPr>
-            </w:pPr>
-            <w:r>
-              <w:rPr>
-                <w:rFonts w:ascii="TH SarabunPSK" w:hAnsi="TH SarabunPSK" w:cs="TH SarabunPSK"/>
-                <w:szCs w:val="22"/>
+                <w:sz w:val="18"/>
+                <w:szCs w:val="18"/>
+              </w:rPr>
+            </w:pPr>
+            <w:r>
+              <w:rPr>
+                <w:rFonts w:ascii="TH SarabunPSK" w:hAnsi="TH SarabunPSK" w:cs="TH SarabunPSK"/>
+                <w:sz w:val="18"/>
+                <w:szCs w:val="18"/>
               </w:rPr>
               <w:t>{cle1}</w:t>
             </w:r>
@@ -1440,14 +1482,15 @@
               <w:jc w:val="right"/>
               <w:rPr>
                 <w:rFonts w:ascii="TH SarabunPSK" w:hAnsi="TH SarabunPSK" w:cs="TH SarabunPSK"/>
-                <w:sz w:val="16"/>
-                <w:szCs w:val="16"/>
-              </w:rPr>
-            </w:pPr>
-            <w:r>
-              <w:rPr>
-                <w:rFonts w:ascii="TH SarabunPSK" w:hAnsi="TH SarabunPSK" w:cs="TH SarabunPSK"/>
-                <w:szCs w:val="22"/>
+                <w:sz w:val="18"/>
+                <w:szCs w:val="18"/>
+              </w:rPr>
+            </w:pPr>
+            <w:r>
+              <w:rPr>
+                <w:rFonts w:ascii="TH SarabunPSK" w:hAnsi="TH SarabunPSK" w:cs="TH SarabunPSK"/>
+                <w:sz w:val="18"/>
+                <w:szCs w:val="18"/>
               </w:rPr>
               <w:t>{cle11}</w:t>
             </w:r>
@@ -1462,13 +1505,15 @@
             <w:pPr>
               <w:rPr>
                 <w:rFonts w:ascii="TH SarabunPSK" w:hAnsi="TH SarabunPSK" w:cs="TH SarabunPSK"/>
-                <w:szCs w:val="22"/>
-              </w:rPr>
-            </w:pPr>
-            <w:r>
-              <w:rPr>
-                <w:rFonts w:ascii="TH SarabunPSK" w:hAnsi="TH SarabunPSK" w:cs="TH SarabunPSK"/>
-                <w:szCs w:val="22"/>
+                <w:sz w:val="18"/>
+                <w:szCs w:val="18"/>
+              </w:rPr>
+            </w:pPr>
+            <w:r>
+              <w:rPr>
+                <w:rFonts w:ascii="TH SarabunPSK" w:hAnsi="TH SarabunPSK" w:cs="TH SarabunPSK"/>
+                <w:sz w:val="18"/>
+                <w:szCs w:val="18"/>
               </w:rPr>
               <w:t>{cla1}</w:t>
             </w:r>
@@ -1478,14 +1523,15 @@
               <w:jc w:val="right"/>
               <w:rPr>
                 <w:rFonts w:ascii="TH SarabunPSK" w:hAnsi="TH SarabunPSK" w:cs="TH SarabunPSK"/>
-                <w:sz w:val="16"/>
-                <w:szCs w:val="16"/>
-              </w:rPr>
-            </w:pPr>
-            <w:r>
-              <w:rPr>
-                <w:rFonts w:ascii="TH SarabunPSK" w:hAnsi="TH SarabunPSK" w:cs="TH SarabunPSK"/>
-                <w:szCs w:val="22"/>
+                <w:sz w:val="18"/>
+                <w:szCs w:val="18"/>
+              </w:rPr>
+            </w:pPr>
+            <w:r>
+              <w:rPr>
+                <w:rFonts w:ascii="TH SarabunPSK" w:hAnsi="TH SarabunPSK" w:cs="TH SarabunPSK"/>
+                <w:sz w:val="18"/>
+                <w:szCs w:val="18"/>
               </w:rPr>
               <w:t>{cla11}</w:t>
             </w:r>
@@ -1691,13 +1737,15 @@
             <w:pPr>
               <w:rPr>
                 <w:rFonts w:ascii="TH SarabunPSK" w:hAnsi="TH SarabunPSK" w:cs="TH SarabunPSK"/>
-                <w:szCs w:val="22"/>
-              </w:rPr>
-            </w:pPr>
-            <w:r>
-              <w:rPr>
-                <w:rFonts w:ascii="TH SarabunPSK" w:hAnsi="TH SarabunPSK" w:cs="TH SarabunPSK"/>
-                <w:szCs w:val="22"/>
+                <w:sz w:val="18"/>
+                <w:szCs w:val="18"/>
+              </w:rPr>
+            </w:pPr>
+            <w:r>
+              <w:rPr>
+                <w:rFonts w:ascii="TH SarabunPSK" w:hAnsi="TH SarabunPSK" w:cs="TH SarabunPSK"/>
+                <w:sz w:val="18"/>
+                <w:szCs w:val="18"/>
               </w:rPr>
               <w:t>{lec2}</w:t>
             </w:r>
@@ -1707,13 +1755,15 @@
               <w:jc w:val="right"/>
               <w:rPr>
                 <w:rFonts w:ascii="TH SarabunPSK" w:hAnsi="TH SarabunPSK" w:cs="TH SarabunPSK"/>
-                <w:szCs w:val="22"/>
-              </w:rPr>
-            </w:pPr>
-            <w:r>
-              <w:rPr>
-                <w:rFonts w:ascii="TH SarabunPSK" w:hAnsi="TH SarabunPSK" w:cs="TH SarabunPSK"/>
-                <w:szCs w:val="22"/>
+                <w:sz w:val="18"/>
+                <w:szCs w:val="18"/>
+              </w:rPr>
+            </w:pPr>
+            <w:r>
+              <w:rPr>
+                <w:rFonts w:ascii="TH SarabunPSK" w:hAnsi="TH SarabunPSK" w:cs="TH SarabunPSK"/>
+                <w:sz w:val="18"/>
+                <w:szCs w:val="18"/>
               </w:rPr>
               <w:t>{lec22}</w:t>
             </w:r>
@@ -1728,13 +1778,15 @@
             <w:pPr>
               <w:rPr>
                 <w:rFonts w:ascii="TH SarabunPSK" w:hAnsi="TH SarabunPSK" w:cs="TH SarabunPSK"/>
-                <w:szCs w:val="22"/>
-              </w:rPr>
-            </w:pPr>
-            <w:r>
-              <w:rPr>
-                <w:rFonts w:ascii="TH SarabunPSK" w:hAnsi="TH SarabunPSK" w:cs="TH SarabunPSK"/>
-                <w:szCs w:val="22"/>
+                <w:sz w:val="18"/>
+                <w:szCs w:val="18"/>
+              </w:rPr>
+            </w:pPr>
+            <w:r>
+              <w:rPr>
+                <w:rFonts w:ascii="TH SarabunPSK" w:hAnsi="TH SarabunPSK" w:cs="TH SarabunPSK"/>
+                <w:sz w:val="18"/>
+                <w:szCs w:val="18"/>
               </w:rPr>
               <w:t>{lab2}</w:t>
             </w:r>
@@ -1744,13 +1796,15 @@
               <w:jc w:val="right"/>
               <w:rPr>
                 <w:rFonts w:ascii="TH SarabunPSK" w:hAnsi="TH SarabunPSK" w:cs="TH SarabunPSK"/>
-                <w:szCs w:val="22"/>
-              </w:rPr>
-            </w:pPr>
-            <w:r>
-              <w:rPr>
-                <w:rFonts w:ascii="TH SarabunPSK" w:hAnsi="TH SarabunPSK" w:cs="TH SarabunPSK"/>
-                <w:szCs w:val="22"/>
+                <w:sz w:val="18"/>
+                <w:szCs w:val="18"/>
+              </w:rPr>
+            </w:pPr>
+            <w:r>
+              <w:rPr>
+                <w:rFonts w:ascii="TH SarabunPSK" w:hAnsi="TH SarabunPSK" w:cs="TH SarabunPSK"/>
+                <w:sz w:val="18"/>
+                <w:szCs w:val="18"/>
               </w:rPr>
               <w:t>{lab22}</w:t>
             </w:r>
@@ -1787,13 +1841,15 @@
             <w:pPr>
               <w:rPr>
                 <w:rFonts w:ascii="TH SarabunPSK" w:hAnsi="TH SarabunPSK" w:cs="TH SarabunPSK"/>
-                <w:szCs w:val="22"/>
-              </w:rPr>
-            </w:pPr>
-            <w:r>
-              <w:rPr>
-                <w:rFonts w:ascii="TH SarabunPSK" w:hAnsi="TH SarabunPSK" w:cs="TH SarabunPSK"/>
-                <w:szCs w:val="22"/>
+                <w:sz w:val="18"/>
+                <w:szCs w:val="18"/>
+              </w:rPr>
+            </w:pPr>
+            <w:r>
+              <w:rPr>
+                <w:rFonts w:ascii="TH SarabunPSK" w:hAnsi="TH SarabunPSK" w:cs="TH SarabunPSK"/>
+                <w:sz w:val="18"/>
+                <w:szCs w:val="18"/>
               </w:rPr>
               <w:t>{cle2}</w:t>
             </w:r>
@@ -1803,14 +1859,15 @@
               <w:jc w:val="right"/>
               <w:rPr>
                 <w:rFonts w:ascii="TH SarabunPSK" w:hAnsi="TH SarabunPSK" w:cs="TH SarabunPSK"/>
-                <w:sz w:val="16"/>
-                <w:szCs w:val="16"/>
-              </w:rPr>
-            </w:pPr>
-            <w:r>
-              <w:rPr>
-                <w:rFonts w:ascii="TH SarabunPSK" w:hAnsi="TH SarabunPSK" w:cs="TH SarabunPSK"/>
-                <w:szCs w:val="22"/>
+                <w:sz w:val="18"/>
+                <w:szCs w:val="18"/>
+              </w:rPr>
+            </w:pPr>
+            <w:r>
+              <w:rPr>
+                <w:rFonts w:ascii="TH SarabunPSK" w:hAnsi="TH SarabunPSK" w:cs="TH SarabunPSK"/>
+                <w:sz w:val="18"/>
+                <w:szCs w:val="18"/>
               </w:rPr>
               <w:t>{cle22}</w:t>
             </w:r>
@@ -1825,13 +1882,15 @@
             <w:pPr>
               <w:rPr>
                 <w:rFonts w:ascii="TH SarabunPSK" w:hAnsi="TH SarabunPSK" w:cs="TH SarabunPSK"/>
-                <w:szCs w:val="22"/>
-              </w:rPr>
-            </w:pPr>
-            <w:r>
-              <w:rPr>
-                <w:rFonts w:ascii="TH SarabunPSK" w:hAnsi="TH SarabunPSK" w:cs="TH SarabunPSK"/>
-                <w:szCs w:val="22"/>
+                <w:sz w:val="18"/>
+                <w:szCs w:val="18"/>
+              </w:rPr>
+            </w:pPr>
+            <w:r>
+              <w:rPr>
+                <w:rFonts w:ascii="TH SarabunPSK" w:hAnsi="TH SarabunPSK" w:cs="TH SarabunPSK"/>
+                <w:sz w:val="18"/>
+                <w:szCs w:val="18"/>
               </w:rPr>
               <w:t>{cla2}</w:t>
             </w:r>
@@ -1841,14 +1900,15 @@
               <w:jc w:val="right"/>
               <w:rPr>
                 <w:rFonts w:ascii="TH SarabunPSK" w:hAnsi="TH SarabunPSK" w:cs="TH SarabunPSK"/>
-                <w:sz w:val="16"/>
-                <w:szCs w:val="16"/>
-              </w:rPr>
-            </w:pPr>
-            <w:r>
-              <w:rPr>
-                <w:rFonts w:ascii="TH SarabunPSK" w:hAnsi="TH SarabunPSK" w:cs="TH SarabunPSK"/>
-                <w:szCs w:val="22"/>
+                <w:sz w:val="18"/>
+                <w:szCs w:val="18"/>
+              </w:rPr>
+            </w:pPr>
+            <w:r>
+              <w:rPr>
+                <w:rFonts w:ascii="TH SarabunPSK" w:hAnsi="TH SarabunPSK" w:cs="TH SarabunPSK"/>
+                <w:sz w:val="18"/>
+                <w:szCs w:val="18"/>
               </w:rPr>
               <w:t>{cla22}</w:t>
             </w:r>
@@ -2052,13 +2112,15 @@
             <w:pPr>
               <w:rPr>
                 <w:rFonts w:ascii="TH SarabunPSK" w:hAnsi="TH SarabunPSK" w:cs="TH SarabunPSK"/>
-                <w:szCs w:val="22"/>
-              </w:rPr>
-            </w:pPr>
-            <w:r>
-              <w:rPr>
-                <w:rFonts w:ascii="TH SarabunPSK" w:hAnsi="TH SarabunPSK" w:cs="TH SarabunPSK"/>
-                <w:szCs w:val="22"/>
+                <w:sz w:val="18"/>
+                <w:szCs w:val="18"/>
+              </w:rPr>
+            </w:pPr>
+            <w:r>
+              <w:rPr>
+                <w:rFonts w:ascii="TH SarabunPSK" w:hAnsi="TH SarabunPSK" w:cs="TH SarabunPSK"/>
+                <w:sz w:val="18"/>
+                <w:szCs w:val="18"/>
               </w:rPr>
               <w:t>{lec3}</w:t>
             </w:r>
@@ -2068,13 +2130,15 @@
               <w:jc w:val="right"/>
               <w:rPr>
                 <w:rFonts w:ascii="TH SarabunPSK" w:hAnsi="TH SarabunPSK" w:cs="TH SarabunPSK"/>
-                <w:szCs w:val="22"/>
-              </w:rPr>
-            </w:pPr>
-            <w:r>
-              <w:rPr>
-                <w:rFonts w:ascii="TH SarabunPSK" w:hAnsi="TH SarabunPSK" w:cs="TH SarabunPSK"/>
-                <w:szCs w:val="22"/>
+                <w:sz w:val="18"/>
+                <w:szCs w:val="18"/>
+              </w:rPr>
+            </w:pPr>
+            <w:r>
+              <w:rPr>
+                <w:rFonts w:ascii="TH SarabunPSK" w:hAnsi="TH SarabunPSK" w:cs="TH SarabunPSK"/>
+                <w:sz w:val="18"/>
+                <w:szCs w:val="18"/>
               </w:rPr>
               <w:t>{lec33}</w:t>
             </w:r>
@@ -2089,13 +2153,15 @@
             <w:pPr>
               <w:rPr>
                 <w:rFonts w:ascii="TH SarabunPSK" w:hAnsi="TH SarabunPSK" w:cs="TH SarabunPSK"/>
-                <w:szCs w:val="22"/>
-              </w:rPr>
-            </w:pPr>
-            <w:r>
-              <w:rPr>
-                <w:rFonts w:ascii="TH SarabunPSK" w:hAnsi="TH SarabunPSK" w:cs="TH SarabunPSK"/>
-                <w:szCs w:val="22"/>
+                <w:sz w:val="18"/>
+                <w:szCs w:val="18"/>
+              </w:rPr>
+            </w:pPr>
+            <w:r>
+              <w:rPr>
+                <w:rFonts w:ascii="TH SarabunPSK" w:hAnsi="TH SarabunPSK" w:cs="TH SarabunPSK"/>
+                <w:sz w:val="18"/>
+                <w:szCs w:val="18"/>
               </w:rPr>
               <w:t>{lab3}</w:t>
             </w:r>
@@ -2105,13 +2171,15 @@
               <w:jc w:val="right"/>
               <w:rPr>
                 <w:rFonts w:ascii="TH SarabunPSK" w:hAnsi="TH SarabunPSK" w:cs="TH SarabunPSK"/>
-                <w:szCs w:val="22"/>
-              </w:rPr>
-            </w:pPr>
-            <w:r>
-              <w:rPr>
-                <w:rFonts w:ascii="TH SarabunPSK" w:hAnsi="TH SarabunPSK" w:cs="TH SarabunPSK"/>
-                <w:szCs w:val="22"/>
+                <w:sz w:val="18"/>
+                <w:szCs w:val="18"/>
+              </w:rPr>
+            </w:pPr>
+            <w:r>
+              <w:rPr>
+                <w:rFonts w:ascii="TH SarabunPSK" w:hAnsi="TH SarabunPSK" w:cs="TH SarabunPSK"/>
+                <w:sz w:val="18"/>
+                <w:szCs w:val="18"/>
               </w:rPr>
               <w:t>{lab33}</w:t>
             </w:r>
@@ -2148,13 +2216,15 @@
             <w:pPr>
               <w:rPr>
                 <w:rFonts w:ascii="TH SarabunPSK" w:hAnsi="TH SarabunPSK" w:cs="TH SarabunPSK"/>
-                <w:szCs w:val="22"/>
-              </w:rPr>
-            </w:pPr>
-            <w:r>
-              <w:rPr>
-                <w:rFonts w:ascii="TH SarabunPSK" w:hAnsi="TH SarabunPSK" w:cs="TH SarabunPSK"/>
-                <w:szCs w:val="22"/>
+                <w:sz w:val="18"/>
+                <w:szCs w:val="18"/>
+              </w:rPr>
+            </w:pPr>
+            <w:r>
+              <w:rPr>
+                <w:rFonts w:ascii="TH SarabunPSK" w:hAnsi="TH SarabunPSK" w:cs="TH SarabunPSK"/>
+                <w:sz w:val="18"/>
+                <w:szCs w:val="18"/>
               </w:rPr>
               <w:t>{cle3}</w:t>
             </w:r>
@@ -2164,14 +2234,15 @@
               <w:jc w:val="right"/>
               <w:rPr>
                 <w:rFonts w:ascii="TH SarabunPSK" w:hAnsi="TH SarabunPSK" w:cs="TH SarabunPSK"/>
-                <w:sz w:val="16"/>
-                <w:szCs w:val="16"/>
-              </w:rPr>
-            </w:pPr>
-            <w:r>
-              <w:rPr>
-                <w:rFonts w:ascii="TH SarabunPSK" w:hAnsi="TH SarabunPSK" w:cs="TH SarabunPSK"/>
-                <w:szCs w:val="22"/>
+                <w:sz w:val="18"/>
+                <w:szCs w:val="18"/>
+              </w:rPr>
+            </w:pPr>
+            <w:r>
+              <w:rPr>
+                <w:rFonts w:ascii="TH SarabunPSK" w:hAnsi="TH SarabunPSK" w:cs="TH SarabunPSK"/>
+                <w:sz w:val="18"/>
+                <w:szCs w:val="18"/>
               </w:rPr>
               <w:t>{cle33}</w:t>
             </w:r>
@@ -2186,13 +2257,15 @@
             <w:pPr>
               <w:rPr>
                 <w:rFonts w:ascii="TH SarabunPSK" w:hAnsi="TH SarabunPSK" w:cs="TH SarabunPSK"/>
-                <w:szCs w:val="22"/>
-              </w:rPr>
-            </w:pPr>
-            <w:r>
-              <w:rPr>
-                <w:rFonts w:ascii="TH SarabunPSK" w:hAnsi="TH SarabunPSK" w:cs="TH SarabunPSK"/>
-                <w:szCs w:val="22"/>
+                <w:sz w:val="18"/>
+                <w:szCs w:val="18"/>
+              </w:rPr>
+            </w:pPr>
+            <w:r>
+              <w:rPr>
+                <w:rFonts w:ascii="TH SarabunPSK" w:hAnsi="TH SarabunPSK" w:cs="TH SarabunPSK"/>
+                <w:sz w:val="18"/>
+                <w:szCs w:val="18"/>
               </w:rPr>
               <w:t>{cla3}</w:t>
             </w:r>
@@ -2202,14 +2275,15 @@
               <w:jc w:val="right"/>
               <w:rPr>
                 <w:rFonts w:ascii="TH SarabunPSK" w:hAnsi="TH SarabunPSK" w:cs="TH SarabunPSK"/>
-                <w:sz w:val="16"/>
-                <w:szCs w:val="16"/>
-              </w:rPr>
-            </w:pPr>
-            <w:r>
-              <w:rPr>
-                <w:rFonts w:ascii="TH SarabunPSK" w:hAnsi="TH SarabunPSK" w:cs="TH SarabunPSK"/>
-                <w:szCs w:val="22"/>
+                <w:sz w:val="18"/>
+                <w:szCs w:val="18"/>
+              </w:rPr>
+            </w:pPr>
+            <w:r>
+              <w:rPr>
+                <w:rFonts w:ascii="TH SarabunPSK" w:hAnsi="TH SarabunPSK" w:cs="TH SarabunPSK"/>
+                <w:sz w:val="18"/>
+                <w:szCs w:val="18"/>
               </w:rPr>
               <w:t>{cla33}</w:t>
             </w:r>
@@ -2411,13 +2485,15 @@
             <w:pPr>
               <w:rPr>
                 <w:rFonts w:ascii="TH SarabunPSK" w:hAnsi="TH SarabunPSK" w:cs="TH SarabunPSK"/>
-                <w:szCs w:val="22"/>
-              </w:rPr>
-            </w:pPr>
-            <w:r>
-              <w:rPr>
-                <w:rFonts w:ascii="TH SarabunPSK" w:hAnsi="TH SarabunPSK" w:cs="TH SarabunPSK"/>
-                <w:szCs w:val="22"/>
+                <w:sz w:val="18"/>
+                <w:szCs w:val="18"/>
+              </w:rPr>
+            </w:pPr>
+            <w:r>
+              <w:rPr>
+                <w:rFonts w:ascii="TH SarabunPSK" w:hAnsi="TH SarabunPSK" w:cs="TH SarabunPSK"/>
+                <w:sz w:val="18"/>
+                <w:szCs w:val="18"/>
               </w:rPr>
               <w:t>{lec4}</w:t>
             </w:r>
@@ -2427,13 +2503,15 @@
               <w:jc w:val="right"/>
               <w:rPr>
                 <w:rFonts w:ascii="TH SarabunPSK" w:hAnsi="TH SarabunPSK" w:cs="TH SarabunPSK"/>
-                <w:szCs w:val="22"/>
-              </w:rPr>
-            </w:pPr>
-            <w:r>
-              <w:rPr>
-                <w:rFonts w:ascii="TH SarabunPSK" w:hAnsi="TH SarabunPSK" w:cs="TH SarabunPSK"/>
-                <w:szCs w:val="22"/>
+                <w:sz w:val="18"/>
+                <w:szCs w:val="18"/>
+              </w:rPr>
+            </w:pPr>
+            <w:r>
+              <w:rPr>
+                <w:rFonts w:ascii="TH SarabunPSK" w:hAnsi="TH SarabunPSK" w:cs="TH SarabunPSK"/>
+                <w:sz w:val="18"/>
+                <w:szCs w:val="18"/>
               </w:rPr>
               <w:t>{lec44}</w:t>
             </w:r>
@@ -2448,13 +2526,15 @@
             <w:pPr>
               <w:rPr>
                 <w:rFonts w:ascii="TH SarabunPSK" w:hAnsi="TH SarabunPSK" w:cs="TH SarabunPSK"/>
-                <w:szCs w:val="22"/>
-              </w:rPr>
-            </w:pPr>
-            <w:r>
-              <w:rPr>
-                <w:rFonts w:ascii="TH SarabunPSK" w:hAnsi="TH SarabunPSK" w:cs="TH SarabunPSK"/>
-                <w:szCs w:val="22"/>
+                <w:sz w:val="18"/>
+                <w:szCs w:val="18"/>
+              </w:rPr>
+            </w:pPr>
+            <w:r>
+              <w:rPr>
+                <w:rFonts w:ascii="TH SarabunPSK" w:hAnsi="TH SarabunPSK" w:cs="TH SarabunPSK"/>
+                <w:sz w:val="18"/>
+                <w:szCs w:val="18"/>
               </w:rPr>
               <w:t>{lab4}</w:t>
             </w:r>
@@ -2464,13 +2544,15 @@
               <w:jc w:val="right"/>
               <w:rPr>
                 <w:rFonts w:ascii="TH SarabunPSK" w:hAnsi="TH SarabunPSK" w:cs="TH SarabunPSK"/>
-                <w:szCs w:val="22"/>
-              </w:rPr>
-            </w:pPr>
-            <w:r>
-              <w:rPr>
-                <w:rFonts w:ascii="TH SarabunPSK" w:hAnsi="TH SarabunPSK" w:cs="TH SarabunPSK"/>
-                <w:szCs w:val="22"/>
+                <w:sz w:val="18"/>
+                <w:szCs w:val="18"/>
+              </w:rPr>
+            </w:pPr>
+            <w:r>
+              <w:rPr>
+                <w:rFonts w:ascii="TH SarabunPSK" w:hAnsi="TH SarabunPSK" w:cs="TH SarabunPSK"/>
+                <w:sz w:val="18"/>
+                <w:szCs w:val="18"/>
               </w:rPr>
               <w:t>{lab44}</w:t>
             </w:r>
@@ -2507,13 +2589,15 @@
             <w:pPr>
               <w:rPr>
                 <w:rFonts w:ascii="TH SarabunPSK" w:hAnsi="TH SarabunPSK" w:cs="TH SarabunPSK"/>
-                <w:szCs w:val="22"/>
-              </w:rPr>
-            </w:pPr>
-            <w:r>
-              <w:rPr>
-                <w:rFonts w:ascii="TH SarabunPSK" w:hAnsi="TH SarabunPSK" w:cs="TH SarabunPSK"/>
-                <w:szCs w:val="22"/>
+                <w:sz w:val="18"/>
+                <w:szCs w:val="18"/>
+              </w:rPr>
+            </w:pPr>
+            <w:r>
+              <w:rPr>
+                <w:rFonts w:ascii="TH SarabunPSK" w:hAnsi="TH SarabunPSK" w:cs="TH SarabunPSK"/>
+                <w:sz w:val="18"/>
+                <w:szCs w:val="18"/>
               </w:rPr>
               <w:t>{cle4}</w:t>
             </w:r>
@@ -2523,14 +2607,15 @@
               <w:jc w:val="right"/>
               <w:rPr>
                 <w:rFonts w:ascii="TH SarabunPSK" w:hAnsi="TH SarabunPSK" w:cs="TH SarabunPSK"/>
-                <w:sz w:val="16"/>
-                <w:szCs w:val="16"/>
-              </w:rPr>
-            </w:pPr>
-            <w:r>
-              <w:rPr>
-                <w:rFonts w:ascii="TH SarabunPSK" w:hAnsi="TH SarabunPSK" w:cs="TH SarabunPSK"/>
-                <w:szCs w:val="22"/>
+                <w:sz w:val="18"/>
+                <w:szCs w:val="18"/>
+              </w:rPr>
+            </w:pPr>
+            <w:r>
+              <w:rPr>
+                <w:rFonts w:ascii="TH SarabunPSK" w:hAnsi="TH SarabunPSK" w:cs="TH SarabunPSK"/>
+                <w:sz w:val="18"/>
+                <w:szCs w:val="18"/>
               </w:rPr>
               <w:t>{cle44}</w:t>
             </w:r>
@@ -2545,13 +2630,15 @@
             <w:pPr>
               <w:rPr>
                 <w:rFonts w:ascii="TH SarabunPSK" w:hAnsi="TH SarabunPSK" w:cs="TH SarabunPSK"/>
-                <w:szCs w:val="22"/>
-              </w:rPr>
-            </w:pPr>
-            <w:r>
-              <w:rPr>
-                <w:rFonts w:ascii="TH SarabunPSK" w:hAnsi="TH SarabunPSK" w:cs="TH SarabunPSK"/>
-                <w:szCs w:val="22"/>
+                <w:sz w:val="18"/>
+                <w:szCs w:val="18"/>
+              </w:rPr>
+            </w:pPr>
+            <w:r>
+              <w:rPr>
+                <w:rFonts w:ascii="TH SarabunPSK" w:hAnsi="TH SarabunPSK" w:cs="TH SarabunPSK"/>
+                <w:sz w:val="18"/>
+                <w:szCs w:val="18"/>
               </w:rPr>
               <w:t>{cla4}</w:t>
             </w:r>
@@ -2561,14 +2648,15 @@
               <w:jc w:val="right"/>
               <w:rPr>
                 <w:rFonts w:ascii="TH SarabunPSK" w:hAnsi="TH SarabunPSK" w:cs="TH SarabunPSK"/>
-                <w:sz w:val="16"/>
-                <w:szCs w:val="16"/>
-              </w:rPr>
-            </w:pPr>
-            <w:r>
-              <w:rPr>
-                <w:rFonts w:ascii="TH SarabunPSK" w:hAnsi="TH SarabunPSK" w:cs="TH SarabunPSK"/>
-                <w:szCs w:val="22"/>
+                <w:sz w:val="18"/>
+                <w:szCs w:val="18"/>
+              </w:rPr>
+            </w:pPr>
+            <w:r>
+              <w:rPr>
+                <w:rFonts w:ascii="TH SarabunPSK" w:hAnsi="TH SarabunPSK" w:cs="TH SarabunPSK"/>
+                <w:sz w:val="18"/>
+                <w:szCs w:val="18"/>
               </w:rPr>
               <w:t>{cla44}</w:t>
             </w:r>
@@ -2770,13 +2858,15 @@
             <w:pPr>
               <w:rPr>
                 <w:rFonts w:ascii="TH SarabunPSK" w:hAnsi="TH SarabunPSK" w:cs="TH SarabunPSK"/>
-                <w:szCs w:val="22"/>
-              </w:rPr>
-            </w:pPr>
-            <w:r>
-              <w:rPr>
-                <w:rFonts w:ascii="TH SarabunPSK" w:hAnsi="TH SarabunPSK" w:cs="TH SarabunPSK"/>
-                <w:szCs w:val="22"/>
+                <w:sz w:val="18"/>
+                <w:szCs w:val="18"/>
+              </w:rPr>
+            </w:pPr>
+            <w:r>
+              <w:rPr>
+                <w:rFonts w:ascii="TH SarabunPSK" w:hAnsi="TH SarabunPSK" w:cs="TH SarabunPSK"/>
+                <w:sz w:val="18"/>
+                <w:szCs w:val="18"/>
               </w:rPr>
               <w:t>{lec5}</w:t>
             </w:r>
@@ -2786,13 +2876,15 @@
               <w:jc w:val="right"/>
               <w:rPr>
                 <w:rFonts w:ascii="TH SarabunPSK" w:hAnsi="TH SarabunPSK" w:cs="TH SarabunPSK"/>
-                <w:szCs w:val="22"/>
-              </w:rPr>
-            </w:pPr>
-            <w:r>
-              <w:rPr>
-                <w:rFonts w:ascii="TH SarabunPSK" w:hAnsi="TH SarabunPSK" w:cs="TH SarabunPSK"/>
-                <w:szCs w:val="22"/>
+                <w:sz w:val="18"/>
+                <w:szCs w:val="18"/>
+              </w:rPr>
+            </w:pPr>
+            <w:r>
+              <w:rPr>
+                <w:rFonts w:ascii="TH SarabunPSK" w:hAnsi="TH SarabunPSK" w:cs="TH SarabunPSK"/>
+                <w:sz w:val="18"/>
+                <w:szCs w:val="18"/>
               </w:rPr>
               <w:t>{lec55}</w:t>
             </w:r>
@@ -2807,13 +2899,15 @@
             <w:pPr>
               <w:rPr>
                 <w:rFonts w:ascii="TH SarabunPSK" w:hAnsi="TH SarabunPSK" w:cs="TH SarabunPSK"/>
-                <w:szCs w:val="22"/>
-              </w:rPr>
-            </w:pPr>
-            <w:r>
-              <w:rPr>
-                <w:rFonts w:ascii="TH SarabunPSK" w:hAnsi="TH SarabunPSK" w:cs="TH SarabunPSK"/>
-                <w:szCs w:val="22"/>
+                <w:sz w:val="18"/>
+                <w:szCs w:val="18"/>
+              </w:rPr>
+            </w:pPr>
+            <w:r>
+              <w:rPr>
+                <w:rFonts w:ascii="TH SarabunPSK" w:hAnsi="TH SarabunPSK" w:cs="TH SarabunPSK"/>
+                <w:sz w:val="18"/>
+                <w:szCs w:val="18"/>
               </w:rPr>
               <w:t>{lab5}</w:t>
             </w:r>
@@ -2823,13 +2917,15 @@
               <w:jc w:val="right"/>
               <w:rPr>
                 <w:rFonts w:ascii="TH SarabunPSK" w:hAnsi="TH SarabunPSK" w:cs="TH SarabunPSK"/>
-                <w:szCs w:val="22"/>
-              </w:rPr>
-            </w:pPr>
-            <w:r>
-              <w:rPr>
-                <w:rFonts w:ascii="TH SarabunPSK" w:hAnsi="TH SarabunPSK" w:cs="TH SarabunPSK"/>
-                <w:szCs w:val="22"/>
+                <w:sz w:val="18"/>
+                <w:szCs w:val="18"/>
+              </w:rPr>
+            </w:pPr>
+            <w:r>
+              <w:rPr>
+                <w:rFonts w:ascii="TH SarabunPSK" w:hAnsi="TH SarabunPSK" w:cs="TH SarabunPSK"/>
+                <w:sz w:val="18"/>
+                <w:szCs w:val="18"/>
               </w:rPr>
               <w:t>{lab55}</w:t>
             </w:r>
@@ -2866,13 +2962,15 @@
             <w:pPr>
               <w:rPr>
                 <w:rFonts w:ascii="TH SarabunPSK" w:hAnsi="TH SarabunPSK" w:cs="TH SarabunPSK"/>
-                <w:szCs w:val="22"/>
-              </w:rPr>
-            </w:pPr>
-            <w:r>
-              <w:rPr>
-                <w:rFonts w:ascii="TH SarabunPSK" w:hAnsi="TH SarabunPSK" w:cs="TH SarabunPSK"/>
-                <w:szCs w:val="22"/>
+                <w:sz w:val="18"/>
+                <w:szCs w:val="18"/>
+              </w:rPr>
+            </w:pPr>
+            <w:r>
+              <w:rPr>
+                <w:rFonts w:ascii="TH SarabunPSK" w:hAnsi="TH SarabunPSK" w:cs="TH SarabunPSK"/>
+                <w:sz w:val="18"/>
+                <w:szCs w:val="18"/>
               </w:rPr>
               <w:t>{cle5}</w:t>
             </w:r>
@@ -2882,14 +2980,15 @@
               <w:jc w:val="right"/>
               <w:rPr>
                 <w:rFonts w:ascii="TH SarabunPSK" w:hAnsi="TH SarabunPSK" w:cs="TH SarabunPSK"/>
-                <w:sz w:val="16"/>
-                <w:szCs w:val="16"/>
-              </w:rPr>
-            </w:pPr>
-            <w:r>
-              <w:rPr>
-                <w:rFonts w:ascii="TH SarabunPSK" w:hAnsi="TH SarabunPSK" w:cs="TH SarabunPSK"/>
-                <w:szCs w:val="22"/>
+                <w:sz w:val="18"/>
+                <w:szCs w:val="18"/>
+              </w:rPr>
+            </w:pPr>
+            <w:r>
+              <w:rPr>
+                <w:rFonts w:ascii="TH SarabunPSK" w:hAnsi="TH SarabunPSK" w:cs="TH SarabunPSK"/>
+                <w:sz w:val="18"/>
+                <w:szCs w:val="18"/>
               </w:rPr>
               <w:t>{cle55}</w:t>
             </w:r>
@@ -2904,13 +3003,15 @@
             <w:pPr>
               <w:rPr>
                 <w:rFonts w:ascii="TH SarabunPSK" w:hAnsi="TH SarabunPSK" w:cs="TH SarabunPSK"/>
-                <w:szCs w:val="22"/>
-              </w:rPr>
-            </w:pPr>
-            <w:r>
-              <w:rPr>
-                <w:rFonts w:ascii="TH SarabunPSK" w:hAnsi="TH SarabunPSK" w:cs="TH SarabunPSK"/>
-                <w:szCs w:val="22"/>
+                <w:sz w:val="18"/>
+                <w:szCs w:val="18"/>
+              </w:rPr>
+            </w:pPr>
+            <w:r>
+              <w:rPr>
+                <w:rFonts w:ascii="TH SarabunPSK" w:hAnsi="TH SarabunPSK" w:cs="TH SarabunPSK"/>
+                <w:sz w:val="18"/>
+                <w:szCs w:val="18"/>
               </w:rPr>
               <w:t>{cla5}</w:t>
             </w:r>
@@ -2920,14 +3021,15 @@
               <w:jc w:val="right"/>
               <w:rPr>
                 <w:rFonts w:ascii="TH SarabunPSK" w:hAnsi="TH SarabunPSK" w:cs="TH SarabunPSK"/>
-                <w:sz w:val="16"/>
-                <w:szCs w:val="16"/>
-              </w:rPr>
-            </w:pPr>
-            <w:r>
-              <w:rPr>
-                <w:rFonts w:ascii="TH SarabunPSK" w:hAnsi="TH SarabunPSK" w:cs="TH SarabunPSK"/>
-                <w:szCs w:val="22"/>
+                <w:sz w:val="18"/>
+                <w:szCs w:val="18"/>
+              </w:rPr>
+            </w:pPr>
+            <w:r>
+              <w:rPr>
+                <w:rFonts w:ascii="TH SarabunPSK" w:hAnsi="TH SarabunPSK" w:cs="TH SarabunPSK"/>
+                <w:sz w:val="18"/>
+                <w:szCs w:val="18"/>
               </w:rPr>
               <w:t>{cla55}</w:t>
             </w:r>
@@ -3129,13 +3231,15 @@
             <w:pPr>
               <w:rPr>
                 <w:rFonts w:ascii="TH SarabunPSK" w:hAnsi="TH SarabunPSK" w:cs="TH SarabunPSK"/>
-                <w:szCs w:val="22"/>
-              </w:rPr>
-            </w:pPr>
-            <w:r>
-              <w:rPr>
-                <w:rFonts w:ascii="TH SarabunPSK" w:hAnsi="TH SarabunPSK" w:cs="TH SarabunPSK"/>
-                <w:szCs w:val="22"/>
+                <w:sz w:val="18"/>
+                <w:szCs w:val="18"/>
+              </w:rPr>
+            </w:pPr>
+            <w:r>
+              <w:rPr>
+                <w:rFonts w:ascii="TH SarabunPSK" w:hAnsi="TH SarabunPSK" w:cs="TH SarabunPSK"/>
+                <w:sz w:val="18"/>
+                <w:szCs w:val="18"/>
               </w:rPr>
               <w:t>{lec6}</w:t>
             </w:r>
@@ -3145,13 +3249,15 @@
               <w:jc w:val="right"/>
               <w:rPr>
                 <w:rFonts w:ascii="TH SarabunPSK" w:hAnsi="TH SarabunPSK" w:cs="TH SarabunPSK"/>
-                <w:szCs w:val="22"/>
-              </w:rPr>
-            </w:pPr>
-            <w:r>
-              <w:rPr>
-                <w:rFonts w:ascii="TH SarabunPSK" w:hAnsi="TH SarabunPSK" w:cs="TH SarabunPSK"/>
-                <w:szCs w:val="22"/>
+                <w:sz w:val="18"/>
+                <w:szCs w:val="18"/>
+              </w:rPr>
+            </w:pPr>
+            <w:r>
+              <w:rPr>
+                <w:rFonts w:ascii="TH SarabunPSK" w:hAnsi="TH SarabunPSK" w:cs="TH SarabunPSK"/>
+                <w:sz w:val="18"/>
+                <w:szCs w:val="18"/>
               </w:rPr>
               <w:t>{lec66}</w:t>
             </w:r>
@@ -3166,13 +3272,15 @@
             <w:pPr>
               <w:rPr>
                 <w:rFonts w:ascii="TH SarabunPSK" w:hAnsi="TH SarabunPSK" w:cs="TH SarabunPSK"/>
-                <w:szCs w:val="22"/>
-              </w:rPr>
-            </w:pPr>
-            <w:r>
-              <w:rPr>
-                <w:rFonts w:ascii="TH SarabunPSK" w:hAnsi="TH SarabunPSK" w:cs="TH SarabunPSK"/>
-                <w:szCs w:val="22"/>
+                <w:sz w:val="18"/>
+                <w:szCs w:val="18"/>
+              </w:rPr>
+            </w:pPr>
+            <w:r>
+              <w:rPr>
+                <w:rFonts w:ascii="TH SarabunPSK" w:hAnsi="TH SarabunPSK" w:cs="TH SarabunPSK"/>
+                <w:sz w:val="18"/>
+                <w:szCs w:val="18"/>
               </w:rPr>
               <w:t>{lab6}</w:t>
             </w:r>
@@ -3182,20 +3290,23 @@
               <w:jc w:val="right"/>
               <w:rPr>
                 <w:rFonts w:ascii="TH SarabunPSK" w:hAnsi="TH SarabunPSK" w:cs="TH SarabunPSK"/>
-                <w:szCs w:val="22"/>
-              </w:rPr>
-            </w:pPr>
-            <w:r>
-              <w:rPr>
-                <w:rFonts w:ascii="TH SarabunPSK" w:hAnsi="TH SarabunPSK" w:cs="TH SarabunPSK"/>
-                <w:szCs w:val="22"/>
+                <w:sz w:val="18"/>
+                <w:szCs w:val="18"/>
+              </w:rPr>
+            </w:pPr>
+            <w:r>
+              <w:rPr>
+                <w:rFonts w:ascii="TH SarabunPSK" w:hAnsi="TH SarabunPSK" w:cs="TH SarabunPSK"/>
+                <w:sz w:val="18"/>
+                <w:szCs w:val="18"/>
               </w:rPr>
               <w:t>{lab66</w:t>
             </w:r>
             <w:r>
               <w:rPr>
                 <w:rFonts w:ascii="TH SarabunPSK" w:hAnsi="TH SarabunPSK" w:cs="TH SarabunPSK"/>
-                <w:szCs w:val="22"/>
+                <w:sz w:val="18"/>
+                <w:szCs w:val="18"/>
               </w:rPr>
               <w:t>}</w:t>
             </w:r>
@@ -3232,13 +3343,15 @@
             <w:pPr>
               <w:rPr>
                 <w:rFonts w:ascii="TH SarabunPSK" w:hAnsi="TH SarabunPSK" w:cs="TH SarabunPSK"/>
-                <w:szCs w:val="22"/>
-              </w:rPr>
-            </w:pPr>
-            <w:r>
-              <w:rPr>
-                <w:rFonts w:ascii="TH SarabunPSK" w:hAnsi="TH SarabunPSK" w:cs="TH SarabunPSK"/>
-                <w:szCs w:val="22"/>
+                <w:sz w:val="18"/>
+                <w:szCs w:val="18"/>
+              </w:rPr>
+            </w:pPr>
+            <w:r>
+              <w:rPr>
+                <w:rFonts w:ascii="TH SarabunPSK" w:hAnsi="TH SarabunPSK" w:cs="TH SarabunPSK"/>
+                <w:sz w:val="18"/>
+                <w:szCs w:val="18"/>
               </w:rPr>
               <w:t>{cle6}</w:t>
             </w:r>
@@ -3248,14 +3361,15 @@
               <w:jc w:val="right"/>
               <w:rPr>
                 <w:rFonts w:ascii="TH SarabunPSK" w:hAnsi="TH SarabunPSK" w:cs="TH SarabunPSK"/>
-                <w:sz w:val="16"/>
-                <w:szCs w:val="16"/>
-              </w:rPr>
-            </w:pPr>
-            <w:r>
-              <w:rPr>
-                <w:rFonts w:ascii="TH SarabunPSK" w:hAnsi="TH SarabunPSK" w:cs="TH SarabunPSK"/>
-                <w:szCs w:val="22"/>
+                <w:sz w:val="18"/>
+                <w:szCs w:val="18"/>
+              </w:rPr>
+            </w:pPr>
+            <w:r>
+              <w:rPr>
+                <w:rFonts w:ascii="TH SarabunPSK" w:hAnsi="TH SarabunPSK" w:cs="TH SarabunPSK"/>
+                <w:sz w:val="18"/>
+                <w:szCs w:val="18"/>
               </w:rPr>
               <w:t>{cle66}</w:t>
             </w:r>
@@ -3270,13 +3384,15 @@
             <w:pPr>
               <w:rPr>
                 <w:rFonts w:ascii="TH SarabunPSK" w:hAnsi="TH SarabunPSK" w:cs="TH SarabunPSK"/>
-                <w:szCs w:val="22"/>
-              </w:rPr>
-            </w:pPr>
-            <w:r>
-              <w:rPr>
-                <w:rFonts w:ascii="TH SarabunPSK" w:hAnsi="TH SarabunPSK" w:cs="TH SarabunPSK"/>
-                <w:szCs w:val="22"/>
+                <w:sz w:val="18"/>
+                <w:szCs w:val="18"/>
+              </w:rPr>
+            </w:pPr>
+            <w:r>
+              <w:rPr>
+                <w:rFonts w:ascii="TH SarabunPSK" w:hAnsi="TH SarabunPSK" w:cs="TH SarabunPSK"/>
+                <w:sz w:val="18"/>
+                <w:szCs w:val="18"/>
               </w:rPr>
               <w:t>{cla6}</w:t>
             </w:r>
@@ -3286,14 +3402,15 @@
               <w:jc w:val="right"/>
               <w:rPr>
                 <w:rFonts w:ascii="TH SarabunPSK" w:hAnsi="TH SarabunPSK" w:cs="TH SarabunPSK"/>
-                <w:sz w:val="16"/>
-                <w:szCs w:val="16"/>
-              </w:rPr>
-            </w:pPr>
-            <w:r>
-              <w:rPr>
-                <w:rFonts w:ascii="TH SarabunPSK" w:hAnsi="TH SarabunPSK" w:cs="TH SarabunPSK"/>
-                <w:szCs w:val="22"/>
+                <w:sz w:val="18"/>
+                <w:szCs w:val="18"/>
+              </w:rPr>
+            </w:pPr>
+            <w:r>
+              <w:rPr>
+                <w:rFonts w:ascii="TH SarabunPSK" w:hAnsi="TH SarabunPSK" w:cs="TH SarabunPSK"/>
+                <w:sz w:val="18"/>
+                <w:szCs w:val="18"/>
               </w:rPr>
               <w:t>{cla66}</w:t>
             </w:r>
@@ -4551,7 +4668,27 @@
                 <w:bCs/>
                 <w:szCs w:val="22"/>
               </w:rPr>
-              <w:t>{ht}</w:t>
+              <w:t>{</w:t>
+            </w:r>
+            <w:proofErr w:type="spellStart"/>
+            <w:r>
+              <w:rPr>
+                <w:rFonts w:ascii="TH SarabunPSK" w:hAnsi="TH SarabunPSK" w:cs="TH SarabunPSK"/>
+                <w:b/>
+                <w:bCs/>
+                <w:szCs w:val="22"/>
+              </w:rPr>
+              <w:t>ht</w:t>
+            </w:r>
+            <w:proofErr w:type="spellEnd"/>
+            <w:r>
+              <w:rPr>
+                <w:rFonts w:ascii="TH SarabunPSK" w:hAnsi="TH SarabunPSK" w:cs="TH SarabunPSK"/>
+                <w:b/>
+                <w:bCs/>
+                <w:szCs w:val="22"/>
+              </w:rPr>
+              <w:t>}</w:t>
             </w:r>
           </w:p>
         </w:tc>
@@ -4611,7 +4748,27 @@
                 <w:bCs/>
                 <w:szCs w:val="22"/>
               </w:rPr>
-              <w:t>{cht}</w:t>
+              <w:t>{</w:t>
+            </w:r>
+            <w:proofErr w:type="spellStart"/>
+            <w:r>
+              <w:rPr>
+                <w:rFonts w:ascii="TH SarabunPSK" w:hAnsi="TH SarabunPSK" w:cs="TH SarabunPSK"/>
+                <w:b/>
+                <w:bCs/>
+                <w:szCs w:val="22"/>
+              </w:rPr>
+              <w:t>cht</w:t>
+            </w:r>
+            <w:proofErr w:type="spellEnd"/>
+            <w:r>
+              <w:rPr>
+                <w:rFonts w:ascii="TH SarabunPSK" w:hAnsi="TH SarabunPSK" w:cs="TH SarabunPSK"/>
+                <w:b/>
+                <w:bCs/>
+                <w:szCs w:val="22"/>
+              </w:rPr>
+              <w:t>}</w:t>
             </w:r>
           </w:p>
         </w:tc>
@@ -4741,7 +4898,23 @@
           <w:rFonts w:ascii="TH SarabunPSK" w:hAnsi="TH SarabunPSK" w:cs="TH SarabunPSK"/>
           <w:sz w:val="28"/>
         </w:rPr>
-        <w:t>{th}</w:t>
+        <w:t>{</w:t>
+      </w:r>
+      <w:proofErr w:type="spellStart"/>
+      <w:r>
+        <w:rPr>
+          <w:rFonts w:ascii="TH SarabunPSK" w:hAnsi="TH SarabunPSK" w:cs="TH SarabunPSK"/>
+          <w:sz w:val="28"/>
+        </w:rPr>
+        <w:t>th</w:t>
+      </w:r>
+      <w:proofErr w:type="spellEnd"/>
+      <w:r>
+        <w:rPr>
+          <w:rFonts w:ascii="TH SarabunPSK" w:hAnsi="TH SarabunPSK" w:cs="TH SarabunPSK"/>
+          <w:sz w:val="28"/>
+        </w:rPr>
+        <w:t>}</w:t>
       </w:r>
       <w:r>
         <w:rPr>

</xml_diff>